<commit_message>
docs: Se agrega documento de arquitectura
</commit_message>
<xml_diff>
--- a/FASE 2/Evidencias Proyecto/Documentacion/Definition of Done.docx
+++ b/FASE 2/Evidencias Proyecto/Documentacion/Definition of Done.docx
@@ -4,7 +4,7 @@
   <w:body>
     <w:p>
       <w:pPr>
-        <w:pStyle w:val="Title"/>
+        <w:pStyle w:val="Ttulo"/>
         <w:rPr>
           <w:rFonts w:ascii="Calibri" w:hAnsi="Calibri" w:cs="Calibri"/>
         </w:rPr>
@@ -18,158 +18,178 @@
     </w:p>
     <w:p>
       <w:pPr>
-        <w:jc w:val="both"/>
-        <w:rPr>
-          <w:rFonts w:ascii="Calibri" w:hAnsi="Calibri" w:cs="Calibri"/>
-        </w:rPr>
-      </w:pPr>
-    </w:p>
-    <w:p>
-      <w:pPr>
-        <w:jc w:val="both"/>
-        <w:rPr>
-          <w:rFonts w:ascii="Calibri" w:hAnsi="Calibri" w:cs="Calibri"/>
-        </w:rPr>
-      </w:pPr>
-    </w:p>
-    <w:p>
-      <w:pPr>
-        <w:jc w:val="both"/>
-        <w:rPr>
-          <w:rFonts w:ascii="Calibri" w:hAnsi="Calibri" w:cs="Calibri"/>
-        </w:rPr>
-      </w:pPr>
-    </w:p>
-    <w:p>
-      <w:pPr>
-        <w:jc w:val="both"/>
-        <w:rPr>
-          <w:rFonts w:ascii="Calibri" w:hAnsi="Calibri" w:cs="Calibri"/>
-        </w:rPr>
-      </w:pPr>
-    </w:p>
-    <w:p>
-      <w:pPr>
-        <w:jc w:val="both"/>
-        <w:rPr>
-          <w:rFonts w:ascii="Calibri" w:hAnsi="Calibri" w:cs="Calibri"/>
-        </w:rPr>
-      </w:pPr>
-    </w:p>
-    <w:p>
-      <w:pPr>
-        <w:jc w:val="both"/>
-        <w:rPr>
-          <w:rFonts w:ascii="Calibri" w:hAnsi="Calibri" w:cs="Calibri"/>
-        </w:rPr>
-      </w:pPr>
-    </w:p>
-    <w:p>
-      <w:pPr>
-        <w:jc w:val="both"/>
-        <w:rPr>
-          <w:rFonts w:ascii="Calibri" w:hAnsi="Calibri" w:cs="Calibri"/>
-        </w:rPr>
-      </w:pPr>
-    </w:p>
-    <w:p>
-      <w:pPr>
-        <w:jc w:val="both"/>
-        <w:rPr>
-          <w:rFonts w:ascii="Calibri" w:hAnsi="Calibri" w:cs="Calibri"/>
-        </w:rPr>
-      </w:pPr>
-    </w:p>
-    <w:p>
-      <w:pPr>
-        <w:jc w:val="both"/>
-        <w:rPr>
-          <w:rFonts w:ascii="Calibri" w:hAnsi="Calibri" w:cs="Calibri"/>
-        </w:rPr>
-      </w:pPr>
-    </w:p>
-    <w:p>
-      <w:pPr>
-        <w:jc w:val="both"/>
-        <w:rPr>
-          <w:rFonts w:ascii="Calibri" w:hAnsi="Calibri" w:cs="Calibri"/>
-        </w:rPr>
-      </w:pPr>
-    </w:p>
-    <w:p>
-      <w:pPr>
-        <w:jc w:val="both"/>
-        <w:rPr>
-          <w:rFonts w:ascii="Calibri" w:hAnsi="Calibri" w:cs="Calibri"/>
-        </w:rPr>
-      </w:pPr>
-    </w:p>
-    <w:p>
-      <w:pPr>
-        <w:jc w:val="both"/>
-        <w:rPr>
-          <w:rFonts w:ascii="Calibri" w:hAnsi="Calibri" w:cs="Calibri"/>
-        </w:rPr>
-      </w:pPr>
-    </w:p>
-    <w:p>
-      <w:pPr>
-        <w:jc w:val="both"/>
-        <w:rPr>
-          <w:rFonts w:ascii="Calibri" w:hAnsi="Calibri" w:cs="Calibri"/>
-        </w:rPr>
-      </w:pPr>
-    </w:p>
-    <w:p>
-      <w:pPr>
-        <w:jc w:val="both"/>
-        <w:rPr>
-          <w:rFonts w:ascii="Calibri" w:hAnsi="Calibri" w:cs="Calibri"/>
-        </w:rPr>
-      </w:pPr>
-    </w:p>
-    <w:p>
-      <w:pPr>
-        <w:jc w:val="both"/>
-        <w:rPr>
-          <w:rFonts w:ascii="Calibri" w:hAnsi="Calibri" w:cs="Calibri"/>
-        </w:rPr>
-      </w:pPr>
-    </w:p>
-    <w:p>
-      <w:pPr>
-        <w:jc w:val="both"/>
-        <w:rPr>
-          <w:rFonts w:ascii="Calibri" w:hAnsi="Calibri" w:cs="Calibri"/>
-        </w:rPr>
-      </w:pPr>
-    </w:p>
-    <w:p>
-      <w:pPr>
-        <w:jc w:val="both"/>
-        <w:rPr>
-          <w:rFonts w:ascii="Calibri" w:hAnsi="Calibri" w:cs="Calibri"/>
-        </w:rPr>
-      </w:pPr>
-    </w:p>
-    <w:p>
-      <w:pPr>
-        <w:jc w:val="both"/>
-        <w:rPr>
-          <w:rFonts w:ascii="Calibri" w:hAnsi="Calibri" w:cs="Calibri"/>
-        </w:rPr>
-      </w:pPr>
-    </w:p>
-    <w:p>
-      <w:pPr>
-        <w:jc w:val="both"/>
-        <w:rPr>
-          <w:rFonts w:ascii="Calibri" w:hAnsi="Calibri" w:cs="Calibri"/>
-        </w:rPr>
-      </w:pPr>
-    </w:p>
-    <w:p>
-      <w:pPr>
+        <w:spacing w:line="278" w:lineRule="auto"/>
+        <w:jc w:val="both"/>
+        <w:rPr>
+          <w:rFonts w:ascii="Calibri" w:hAnsi="Calibri" w:cs="Calibri"/>
+        </w:rPr>
+      </w:pPr>
+    </w:p>
+    <w:p>
+      <w:pPr>
+        <w:spacing w:line="278" w:lineRule="auto"/>
+        <w:jc w:val="both"/>
+        <w:rPr>
+          <w:rFonts w:ascii="Calibri" w:hAnsi="Calibri" w:cs="Calibri"/>
+        </w:rPr>
+      </w:pPr>
+    </w:p>
+    <w:p>
+      <w:pPr>
+        <w:spacing w:line="278" w:lineRule="auto"/>
+        <w:jc w:val="both"/>
+        <w:rPr>
+          <w:rFonts w:ascii="Calibri" w:hAnsi="Calibri" w:cs="Calibri"/>
+        </w:rPr>
+      </w:pPr>
+    </w:p>
+    <w:p>
+      <w:pPr>
+        <w:spacing w:line="278" w:lineRule="auto"/>
+        <w:jc w:val="both"/>
+        <w:rPr>
+          <w:rFonts w:ascii="Calibri" w:hAnsi="Calibri" w:cs="Calibri"/>
+        </w:rPr>
+      </w:pPr>
+    </w:p>
+    <w:p>
+      <w:pPr>
+        <w:spacing w:line="278" w:lineRule="auto"/>
+        <w:jc w:val="both"/>
+        <w:rPr>
+          <w:rFonts w:ascii="Calibri" w:hAnsi="Calibri" w:cs="Calibri"/>
+        </w:rPr>
+      </w:pPr>
+    </w:p>
+    <w:p>
+      <w:pPr>
+        <w:spacing w:line="278" w:lineRule="auto"/>
+        <w:jc w:val="both"/>
+        <w:rPr>
+          <w:rFonts w:ascii="Calibri" w:hAnsi="Calibri" w:cs="Calibri"/>
+        </w:rPr>
+      </w:pPr>
+    </w:p>
+    <w:p>
+      <w:pPr>
+        <w:spacing w:line="278" w:lineRule="auto"/>
+        <w:jc w:val="both"/>
+        <w:rPr>
+          <w:rFonts w:ascii="Calibri" w:hAnsi="Calibri" w:cs="Calibri"/>
+        </w:rPr>
+      </w:pPr>
+    </w:p>
+    <w:p>
+      <w:pPr>
+        <w:spacing w:line="278" w:lineRule="auto"/>
+        <w:jc w:val="both"/>
+        <w:rPr>
+          <w:rFonts w:ascii="Calibri" w:hAnsi="Calibri" w:cs="Calibri"/>
+        </w:rPr>
+      </w:pPr>
+    </w:p>
+    <w:p>
+      <w:pPr>
+        <w:spacing w:line="278" w:lineRule="auto"/>
+        <w:jc w:val="both"/>
+        <w:rPr>
+          <w:rFonts w:ascii="Calibri" w:hAnsi="Calibri" w:cs="Calibri"/>
+        </w:rPr>
+      </w:pPr>
+    </w:p>
+    <w:p>
+      <w:pPr>
+        <w:spacing w:line="278" w:lineRule="auto"/>
+        <w:jc w:val="both"/>
+        <w:rPr>
+          <w:rFonts w:ascii="Calibri" w:hAnsi="Calibri" w:cs="Calibri"/>
+        </w:rPr>
+      </w:pPr>
+    </w:p>
+    <w:p>
+      <w:pPr>
+        <w:spacing w:line="278" w:lineRule="auto"/>
+        <w:jc w:val="both"/>
+        <w:rPr>
+          <w:rFonts w:ascii="Calibri" w:hAnsi="Calibri" w:cs="Calibri"/>
+        </w:rPr>
+      </w:pPr>
+    </w:p>
+    <w:p>
+      <w:pPr>
+        <w:spacing w:line="278" w:lineRule="auto"/>
+        <w:jc w:val="both"/>
+        <w:rPr>
+          <w:rFonts w:ascii="Calibri" w:hAnsi="Calibri" w:cs="Calibri"/>
+        </w:rPr>
+      </w:pPr>
+    </w:p>
+    <w:p>
+      <w:pPr>
+        <w:spacing w:line="278" w:lineRule="auto"/>
+        <w:jc w:val="both"/>
+        <w:rPr>
+          <w:rFonts w:ascii="Calibri" w:hAnsi="Calibri" w:cs="Calibri"/>
+        </w:rPr>
+      </w:pPr>
+    </w:p>
+    <w:p>
+      <w:pPr>
+        <w:spacing w:line="278" w:lineRule="auto"/>
+        <w:jc w:val="both"/>
+        <w:rPr>
+          <w:rFonts w:ascii="Calibri" w:hAnsi="Calibri" w:cs="Calibri"/>
+        </w:rPr>
+      </w:pPr>
+    </w:p>
+    <w:p>
+      <w:pPr>
+        <w:spacing w:line="278" w:lineRule="auto"/>
+        <w:jc w:val="both"/>
+        <w:rPr>
+          <w:rFonts w:ascii="Calibri" w:hAnsi="Calibri" w:cs="Calibri"/>
+        </w:rPr>
+      </w:pPr>
+    </w:p>
+    <w:p>
+      <w:pPr>
+        <w:spacing w:line="278" w:lineRule="auto"/>
+        <w:jc w:val="both"/>
+        <w:rPr>
+          <w:rFonts w:ascii="Calibri" w:hAnsi="Calibri" w:cs="Calibri"/>
+        </w:rPr>
+      </w:pPr>
+    </w:p>
+    <w:p>
+      <w:pPr>
+        <w:spacing w:line="278" w:lineRule="auto"/>
+        <w:jc w:val="both"/>
+        <w:rPr>
+          <w:rFonts w:ascii="Calibri" w:hAnsi="Calibri" w:cs="Calibri"/>
+        </w:rPr>
+      </w:pPr>
+    </w:p>
+    <w:p>
+      <w:pPr>
+        <w:spacing w:line="278" w:lineRule="auto"/>
+        <w:jc w:val="both"/>
+        <w:rPr>
+          <w:rFonts w:ascii="Calibri" w:hAnsi="Calibri" w:cs="Calibri"/>
+        </w:rPr>
+      </w:pPr>
+    </w:p>
+    <w:p>
+      <w:pPr>
+        <w:spacing w:line="278" w:lineRule="auto"/>
+        <w:jc w:val="both"/>
+        <w:rPr>
+          <w:rFonts w:ascii="Calibri" w:hAnsi="Calibri" w:cs="Calibri"/>
+        </w:rPr>
+      </w:pPr>
+    </w:p>
+    <w:p>
+      <w:pPr>
+        <w:spacing w:line="278" w:lineRule="auto"/>
         <w:jc w:val="both"/>
         <w:rPr>
           <w:rFonts w:ascii="Calibri" w:hAnsi="Calibri" w:cs="Calibri"/>
@@ -180,17 +200,48 @@
           <w:rFonts w:ascii="Calibri" w:hAnsi="Calibri" w:cs="Calibri"/>
         </w:rPr>
         <w:t>Integrantes: Alejandro Silva</w:t>
+      </w:r>
+      <w:r>
+        <w:rPr>
+          <w:rFonts w:ascii="Calibri" w:hAnsi="Calibri" w:cs="Calibri"/>
+        </w:rPr>
         <w:tab/>
+      </w:r>
+      <w:r>
+        <w:rPr>
+          <w:rFonts w:ascii="Calibri" w:hAnsi="Calibri" w:cs="Calibri"/>
+        </w:rPr>
         <w:tab/>
+      </w:r>
+      <w:r>
+        <w:rPr>
+          <w:rFonts w:ascii="Calibri" w:hAnsi="Calibri" w:cs="Calibri"/>
+        </w:rPr>
         <w:tab/>
+      </w:r>
+      <w:r>
+        <w:rPr>
+          <w:rFonts w:ascii="Calibri" w:hAnsi="Calibri" w:cs="Calibri"/>
+        </w:rPr>
         <w:tab/>
+      </w:r>
+      <w:r>
+        <w:rPr>
+          <w:rFonts w:ascii="Calibri" w:hAnsi="Calibri" w:cs="Calibri"/>
+        </w:rPr>
         <w:tab/>
+      </w:r>
+      <w:r>
+        <w:rPr>
+          <w:rFonts w:ascii="Calibri" w:hAnsi="Calibri" w:cs="Calibri"/>
+        </w:rPr>
         <w:tab/>
         <w:t>Docente: Maria Cobo</w:t>
       </w:r>
     </w:p>
     <w:p>
       <w:pPr>
+        <w:spacing w:line="278" w:lineRule="auto"/>
         <w:jc w:val="both"/>
         <w:rPr>
           <w:rFonts w:ascii="Calibri" w:hAnsi="Calibri" w:cs="Calibri"/>
@@ -206,14 +257,16 @@
     </w:p>
     <w:p>
       <w:pPr>
-        <w:jc w:val="both"/>
-        <w:rPr>
-          <w:rFonts w:ascii="Calibri" w:hAnsi="Calibri" w:cs="Calibri"/>
-        </w:rPr>
-      </w:pPr>
-    </w:p>
-    <w:p>
-      <w:pPr>
+        <w:spacing w:line="278" w:lineRule="auto"/>
+        <w:jc w:val="both"/>
+        <w:rPr>
+          <w:rFonts w:ascii="Calibri" w:hAnsi="Calibri" w:cs="Calibri"/>
+        </w:rPr>
+      </w:pPr>
+    </w:p>
+    <w:p>
+      <w:pPr>
+        <w:spacing w:line="278" w:lineRule="auto"/>
         <w:jc w:val="both"/>
         <w:rPr>
           <w:rFonts w:ascii="Calibri" w:hAnsi="Calibri" w:cs="Calibri"/>
@@ -245,15 +298,16 @@
       <w:sdtContent>
         <w:p>
           <w:pPr>
-            <w:pStyle w:val="TOCHeading"/>
+            <w:pStyle w:val="TtuloTDC"/>
+            <w:pageBreakBefore/>
           </w:pPr>
           <w:r>
-            <w:t>Contents</w:t>
+            <w:t>Índice</w:t>
           </w:r>
         </w:p>
         <w:p>
           <w:pPr>
-            <w:pStyle w:val="TOC1"/>
+            <w:pStyle w:val="TDC1"/>
             <w:tabs>
               <w:tab w:val="right" w:leader="dot" w:pos="8828"/>
             </w:tabs>
@@ -265,13 +319,17 @@
           </w:pPr>
           <w:r>
             <w:fldChar w:fldCharType="begin"/>
+          </w:r>
+          <w:r>
             <w:instrText xml:space="preserve"> TOC \o "1-3" \h \z \u </w:instrText>
+          </w:r>
+          <w:r>
             <w:fldChar w:fldCharType="separate"/>
           </w:r>
           <w:hyperlink w:anchor="_Toc9209101" w:history="1">
             <w:r>
               <w:rPr>
-                <w:rStyle w:val="Hyperlink"/>
+                <w:rStyle w:val="Hipervnculo"/>
                 <w:rFonts w:ascii="Calibri" w:hAnsi="Calibri" w:cs="Calibri"/>
                 <w:noProof/>
               </w:rPr>
@@ -283,17 +341,53 @@
                 <w:webHidden/>
               </w:rPr>
               <w:tab/>
+            </w:r>
+            <w:r>
+              <w:rPr>
+                <w:noProof/>
+                <w:webHidden/>
+              </w:rPr>
               <w:fldChar w:fldCharType="begin"/>
+            </w:r>
+            <w:r>
+              <w:rPr>
+                <w:noProof/>
+                <w:webHidden/>
+              </w:rPr>
               <w:instrText xml:space="preserve"> PAGEREF _Toc9209101 \h </w:instrText>
+            </w:r>
+            <w:r>
+              <w:rPr>
+                <w:noProof/>
+                <w:webHidden/>
+              </w:rPr>
+            </w:r>
+            <w:r>
+              <w:rPr>
+                <w:noProof/>
+                <w:webHidden/>
+              </w:rPr>
               <w:fldChar w:fldCharType="separate"/>
+            </w:r>
+            <w:r>
+              <w:rPr>
+                <w:noProof/>
+                <w:webHidden/>
+              </w:rPr>
               <w:t>3</w:t>
+            </w:r>
+            <w:r>
+              <w:rPr>
+                <w:noProof/>
+                <w:webHidden/>
+              </w:rPr>
               <w:fldChar w:fldCharType="end"/>
             </w:r>
           </w:hyperlink>
         </w:p>
         <w:p>
           <w:pPr>
-            <w:pStyle w:val="TOC1"/>
+            <w:pStyle w:val="TDC1"/>
             <w:tabs>
               <w:tab w:val="right" w:leader="dot" w:pos="8828"/>
             </w:tabs>
@@ -306,7 +400,7 @@
           <w:hyperlink w:anchor="_Toc9209102" w:history="1">
             <w:r>
               <w:rPr>
-                <w:rStyle w:val="Hyperlink"/>
+                <w:rStyle w:val="Hipervnculo"/>
                 <w:rFonts w:ascii="Calibri" w:hAnsi="Calibri" w:cs="Calibri"/>
                 <w:noProof/>
               </w:rPr>
@@ -318,17 +412,53 @@
                 <w:webHidden/>
               </w:rPr>
               <w:tab/>
+            </w:r>
+            <w:r>
+              <w:rPr>
+                <w:noProof/>
+                <w:webHidden/>
+              </w:rPr>
               <w:fldChar w:fldCharType="begin"/>
+            </w:r>
+            <w:r>
+              <w:rPr>
+                <w:noProof/>
+                <w:webHidden/>
+              </w:rPr>
               <w:instrText xml:space="preserve"> PAGEREF _Toc9209102 \h </w:instrText>
+            </w:r>
+            <w:r>
+              <w:rPr>
+                <w:noProof/>
+                <w:webHidden/>
+              </w:rPr>
+            </w:r>
+            <w:r>
+              <w:rPr>
+                <w:noProof/>
+                <w:webHidden/>
+              </w:rPr>
               <w:fldChar w:fldCharType="separate"/>
+            </w:r>
+            <w:r>
+              <w:rPr>
+                <w:noProof/>
+                <w:webHidden/>
+              </w:rPr>
               <w:t>3</w:t>
+            </w:r>
+            <w:r>
+              <w:rPr>
+                <w:noProof/>
+                <w:webHidden/>
+              </w:rPr>
               <w:fldChar w:fldCharType="end"/>
             </w:r>
           </w:hyperlink>
         </w:p>
         <w:p>
           <w:pPr>
-            <w:pStyle w:val="TOC1"/>
+            <w:pStyle w:val="TDC1"/>
             <w:tabs>
               <w:tab w:val="right" w:leader="dot" w:pos="8828"/>
             </w:tabs>
@@ -341,7 +471,7 @@
           <w:hyperlink w:anchor="_Toc9209103" w:history="1">
             <w:r>
               <w:rPr>
-                <w:rStyle w:val="Hyperlink"/>
+                <w:rStyle w:val="Hipervnculo"/>
                 <w:rFonts w:ascii="Calibri" w:hAnsi="Calibri" w:cs="Calibri"/>
                 <w:noProof/>
               </w:rPr>
@@ -353,17 +483,53 @@
                 <w:webHidden/>
               </w:rPr>
               <w:tab/>
+            </w:r>
+            <w:r>
+              <w:rPr>
+                <w:noProof/>
+                <w:webHidden/>
+              </w:rPr>
               <w:fldChar w:fldCharType="begin"/>
+            </w:r>
+            <w:r>
+              <w:rPr>
+                <w:noProof/>
+                <w:webHidden/>
+              </w:rPr>
               <w:instrText xml:space="preserve"> PAGEREF _Toc9209103 \h </w:instrText>
+            </w:r>
+            <w:r>
+              <w:rPr>
+                <w:noProof/>
+                <w:webHidden/>
+              </w:rPr>
+            </w:r>
+            <w:r>
+              <w:rPr>
+                <w:noProof/>
+                <w:webHidden/>
+              </w:rPr>
               <w:fldChar w:fldCharType="separate"/>
+            </w:r>
+            <w:r>
+              <w:rPr>
+                <w:noProof/>
+                <w:webHidden/>
+              </w:rPr>
               <w:t>3</w:t>
+            </w:r>
+            <w:r>
+              <w:rPr>
+                <w:noProof/>
+                <w:webHidden/>
+              </w:rPr>
               <w:fldChar w:fldCharType="end"/>
             </w:r>
           </w:hyperlink>
         </w:p>
         <w:p>
           <w:pPr>
-            <w:pStyle w:val="TOC1"/>
+            <w:pStyle w:val="TDC1"/>
             <w:tabs>
               <w:tab w:val="right" w:leader="dot" w:pos="8828"/>
             </w:tabs>
@@ -376,7 +542,7 @@
           <w:hyperlink w:anchor="_Toc9209104" w:history="1">
             <w:r>
               <w:rPr>
-                <w:rStyle w:val="Hyperlink"/>
+                <w:rStyle w:val="Hipervnculo"/>
                 <w:rFonts w:ascii="Calibri" w:hAnsi="Calibri" w:cs="Calibri"/>
                 <w:noProof/>
               </w:rPr>
@@ -388,17 +554,53 @@
                 <w:webHidden/>
               </w:rPr>
               <w:tab/>
+            </w:r>
+            <w:r>
+              <w:rPr>
+                <w:noProof/>
+                <w:webHidden/>
+              </w:rPr>
               <w:fldChar w:fldCharType="begin"/>
+            </w:r>
+            <w:r>
+              <w:rPr>
+                <w:noProof/>
+                <w:webHidden/>
+              </w:rPr>
               <w:instrText xml:space="preserve"> PAGEREF _Toc9209104 \h </w:instrText>
+            </w:r>
+            <w:r>
+              <w:rPr>
+                <w:noProof/>
+                <w:webHidden/>
+              </w:rPr>
+            </w:r>
+            <w:r>
+              <w:rPr>
+                <w:noProof/>
+                <w:webHidden/>
+              </w:rPr>
               <w:fldChar w:fldCharType="separate"/>
+            </w:r>
+            <w:r>
+              <w:rPr>
+                <w:noProof/>
+                <w:webHidden/>
+              </w:rPr>
               <w:t>4</w:t>
+            </w:r>
+            <w:r>
+              <w:rPr>
+                <w:noProof/>
+                <w:webHidden/>
+              </w:rPr>
               <w:fldChar w:fldCharType="end"/>
             </w:r>
           </w:hyperlink>
         </w:p>
         <w:p>
           <w:pPr>
-            <w:pStyle w:val="TOC1"/>
+            <w:pStyle w:val="TDC1"/>
             <w:tabs>
               <w:tab w:val="right" w:leader="dot" w:pos="8828"/>
             </w:tabs>
@@ -411,7 +613,7 @@
           <w:hyperlink w:anchor="_Toc9209105" w:history="1">
             <w:r>
               <w:rPr>
-                <w:rStyle w:val="Hyperlink"/>
+                <w:rStyle w:val="Hipervnculo"/>
                 <w:rFonts w:ascii="Calibri" w:hAnsi="Calibri" w:cs="Calibri"/>
                 <w:noProof/>
               </w:rPr>
@@ -423,17 +625,53 @@
                 <w:webHidden/>
               </w:rPr>
               <w:tab/>
+            </w:r>
+            <w:r>
+              <w:rPr>
+                <w:noProof/>
+                <w:webHidden/>
+              </w:rPr>
               <w:fldChar w:fldCharType="begin"/>
+            </w:r>
+            <w:r>
+              <w:rPr>
+                <w:noProof/>
+                <w:webHidden/>
+              </w:rPr>
               <w:instrText xml:space="preserve"> PAGEREF _Toc9209105 \h </w:instrText>
+            </w:r>
+            <w:r>
+              <w:rPr>
+                <w:noProof/>
+                <w:webHidden/>
+              </w:rPr>
+            </w:r>
+            <w:r>
+              <w:rPr>
+                <w:noProof/>
+                <w:webHidden/>
+              </w:rPr>
               <w:fldChar w:fldCharType="separate"/>
+            </w:r>
+            <w:r>
+              <w:rPr>
+                <w:noProof/>
+                <w:webHidden/>
+              </w:rPr>
               <w:t>5</w:t>
+            </w:r>
+            <w:r>
+              <w:rPr>
+                <w:noProof/>
+                <w:webHidden/>
+              </w:rPr>
               <w:fldChar w:fldCharType="end"/>
             </w:r>
           </w:hyperlink>
         </w:p>
         <w:p>
           <w:pPr>
-            <w:pStyle w:val="TOC1"/>
+            <w:pStyle w:val="TDC1"/>
             <w:tabs>
               <w:tab w:val="right" w:leader="dot" w:pos="8828"/>
             </w:tabs>
@@ -446,7 +684,7 @@
           <w:hyperlink w:anchor="_Toc9209106" w:history="1">
             <w:r>
               <w:rPr>
-                <w:rStyle w:val="Hyperlink"/>
+                <w:rStyle w:val="Hipervnculo"/>
                 <w:rFonts w:ascii="Calibri" w:hAnsi="Calibri" w:cs="Calibri"/>
                 <w:noProof/>
               </w:rPr>
@@ -458,10 +696,46 @@
                 <w:webHidden/>
               </w:rPr>
               <w:tab/>
+            </w:r>
+            <w:r>
+              <w:rPr>
+                <w:noProof/>
+                <w:webHidden/>
+              </w:rPr>
               <w:fldChar w:fldCharType="begin"/>
+            </w:r>
+            <w:r>
+              <w:rPr>
+                <w:noProof/>
+                <w:webHidden/>
+              </w:rPr>
               <w:instrText xml:space="preserve"> PAGEREF _Toc9209106 \h </w:instrText>
+            </w:r>
+            <w:r>
+              <w:rPr>
+                <w:noProof/>
+                <w:webHidden/>
+              </w:rPr>
+            </w:r>
+            <w:r>
+              <w:rPr>
+                <w:noProof/>
+                <w:webHidden/>
+              </w:rPr>
               <w:fldChar w:fldCharType="separate"/>
+            </w:r>
+            <w:r>
+              <w:rPr>
+                <w:noProof/>
+                <w:webHidden/>
+              </w:rPr>
               <w:t>5</w:t>
+            </w:r>
+            <w:r>
+              <w:rPr>
+                <w:noProof/>
+                <w:webHidden/>
+              </w:rPr>
               <w:fldChar w:fldCharType="end"/>
             </w:r>
           </w:hyperlink>
@@ -483,7 +757,7 @@
     </w:p>
     <w:p>
       <w:pPr>
-        <w:pStyle w:val="Heading1"/>
+        <w:pStyle w:val="Ttulo1"/>
         <w:jc w:val="both"/>
         <w:rPr>
           <w:rFonts w:ascii="Calibri" w:hAnsi="Calibri" w:cs="Calibri"/>
@@ -504,15 +778,15 @@
         <w:jc w:val="both"/>
         <w:rPr>
           <w:rFonts w:ascii="Calibri" w:hAnsi="Calibri" w:cs="Calibri"/>
-          <w:sz w:val="20"/>
-          <w:szCs w:val="20"/>
+          <w:sz w:val="22"/>
+          <w:szCs w:val="22"/>
         </w:rPr>
       </w:pPr>
       <w:r>
         <w:rPr>
           <w:rFonts w:ascii="Calibri" w:hAnsi="Calibri" w:cs="Calibri"/>
-          <w:sz w:val="20"/>
-          <w:szCs w:val="20"/>
+          <w:sz w:val="22"/>
+          <w:szCs w:val="22"/>
         </w:rPr>
         <w:t>La Definition of Done (DoD) establece las condiciones que debe cumplir un elemento para ser considerado terminado dentro de ErgoSense. Es común a todos los Sprints y es acordada por el equipo antes del inicio del desarrollo, de modo que ambos integrantes compartan el mismo criterio de término y la calidad del incremento no dependa de interpretaciones individuales.</w:t>
       </w:r>
@@ -522,15 +796,15 @@
         <w:jc w:val="both"/>
         <w:rPr>
           <w:rFonts w:ascii="Calibri" w:hAnsi="Calibri" w:cs="Calibri"/>
-          <w:sz w:val="20"/>
-          <w:szCs w:val="20"/>
+          <w:sz w:val="22"/>
+          <w:szCs w:val="22"/>
         </w:rPr>
       </w:pPr>
       <w:r>
         <w:rPr>
           <w:rFonts w:ascii="Calibri" w:hAnsi="Calibri" w:cs="Calibri"/>
-          <w:sz w:val="20"/>
-          <w:szCs w:val="20"/>
+          <w:sz w:val="22"/>
+          <w:szCs w:val="22"/>
         </w:rPr>
         <w:t>Un elemento que no cumple todas las condiciones no se considera terminado: no se presenta como completado en la Sprint Review y continúa en el Sprint siguiente o vuelve al Product Backlog para ser repriorizado.</w:t>
       </w:r>
@@ -540,14 +814,14 @@
         <w:jc w:val="both"/>
         <w:rPr>
           <w:rFonts w:ascii="Calibri" w:hAnsi="Calibri" w:cs="Calibri"/>
-          <w:sz w:val="20"/>
-          <w:szCs w:val="20"/>
-        </w:rPr>
-      </w:pPr>
-    </w:p>
-    <w:p>
-      <w:pPr>
-        <w:pStyle w:val="Heading1"/>
+          <w:sz w:val="22"/>
+          <w:szCs w:val="22"/>
+        </w:rPr>
+      </w:pPr>
+    </w:p>
+    <w:p>
+      <w:pPr>
+        <w:pStyle w:val="Ttulo1"/>
         <w:jc w:val="both"/>
         <w:rPr>
           <w:rFonts w:ascii="Calibri" w:hAnsi="Calibri" w:cs="Calibri"/>
@@ -567,15 +841,15 @@
         <w:jc w:val="both"/>
         <w:rPr>
           <w:rFonts w:ascii="Calibri" w:hAnsi="Calibri" w:cs="Calibri"/>
-          <w:sz w:val="20"/>
-          <w:szCs w:val="20"/>
+          <w:sz w:val="22"/>
+          <w:szCs w:val="22"/>
         </w:rPr>
       </w:pPr>
       <w:r>
         <w:rPr>
           <w:rFonts w:ascii="Calibri" w:hAnsi="Calibri" w:cs="Calibri"/>
-          <w:sz w:val="20"/>
-          <w:szCs w:val="20"/>
+          <w:sz w:val="22"/>
+          <w:szCs w:val="22"/>
         </w:rPr>
         <w:t>Esta Definition of Done aplica a todos los elementos del Product Backlog (PB-01 a PB-51) y a las tareas de los Sprint Backlogs 01 a 06, tanto de la aplicación de escritorio como del servidor de ErgoSense (API REST y base de datos PostgreSQL).</w:t>
       </w:r>
@@ -585,15 +859,15 @@
         <w:jc w:val="both"/>
         <w:rPr>
           <w:rFonts w:ascii="Calibri" w:hAnsi="Calibri" w:cs="Calibri"/>
-          <w:sz w:val="20"/>
-          <w:szCs w:val="20"/>
+          <w:sz w:val="22"/>
+          <w:szCs w:val="22"/>
         </w:rPr>
       </w:pPr>
       <w:r>
         <w:rPr>
           <w:rFonts w:ascii="Calibri" w:hAnsi="Calibri" w:cs="Calibri"/>
-          <w:sz w:val="20"/>
-          <w:szCs w:val="20"/>
+          <w:sz w:val="22"/>
+          <w:szCs w:val="22"/>
         </w:rPr>
         <w:t>Los criterios de aceptación de cada elemento, definidos en el Product Backlog y en los Sprint Backlogs, indican qué debe hacer la funcionalidad. La Definition of Done, en cambio, indica las condiciones de calidad que todo elemento debe cumplir, independientemente de su contenido.</w:t>
       </w:r>
@@ -603,134 +877,134 @@
         <w:jc w:val="both"/>
         <w:rPr>
           <w:rFonts w:ascii="Calibri" w:hAnsi="Calibri" w:cs="Calibri"/>
-          <w:sz w:val="20"/>
-          <w:szCs w:val="20"/>
-        </w:rPr>
-      </w:pPr>
-    </w:p>
-    <w:p>
-      <w:pPr>
-        <w:jc w:val="both"/>
-        <w:rPr>
-          <w:rFonts w:ascii="Calibri" w:hAnsi="Calibri" w:cs="Calibri"/>
-          <w:sz w:val="20"/>
-          <w:szCs w:val="20"/>
-        </w:rPr>
-      </w:pPr>
-    </w:p>
-    <w:p>
-      <w:pPr>
-        <w:jc w:val="both"/>
-        <w:rPr>
-          <w:rFonts w:ascii="Calibri" w:hAnsi="Calibri" w:cs="Calibri"/>
-          <w:sz w:val="20"/>
-          <w:szCs w:val="20"/>
-        </w:rPr>
-      </w:pPr>
-    </w:p>
-    <w:p>
-      <w:pPr>
-        <w:jc w:val="both"/>
-        <w:rPr>
-          <w:rFonts w:ascii="Calibri" w:hAnsi="Calibri" w:cs="Calibri"/>
-          <w:sz w:val="20"/>
-          <w:szCs w:val="20"/>
-        </w:rPr>
-      </w:pPr>
-    </w:p>
-    <w:p>
-      <w:pPr>
-        <w:jc w:val="both"/>
-        <w:rPr>
-          <w:rFonts w:ascii="Calibri" w:hAnsi="Calibri" w:cs="Calibri"/>
-          <w:sz w:val="20"/>
-          <w:szCs w:val="20"/>
-        </w:rPr>
-      </w:pPr>
-    </w:p>
-    <w:p>
-      <w:pPr>
-        <w:jc w:val="both"/>
-        <w:rPr>
-          <w:rFonts w:ascii="Calibri" w:hAnsi="Calibri" w:cs="Calibri"/>
-          <w:sz w:val="20"/>
-          <w:szCs w:val="20"/>
-        </w:rPr>
-      </w:pPr>
-    </w:p>
-    <w:p>
-      <w:pPr>
-        <w:jc w:val="both"/>
-        <w:rPr>
-          <w:rFonts w:ascii="Calibri" w:hAnsi="Calibri" w:cs="Calibri"/>
-          <w:sz w:val="20"/>
-          <w:szCs w:val="20"/>
-        </w:rPr>
-      </w:pPr>
-    </w:p>
-    <w:p>
-      <w:pPr>
-        <w:jc w:val="both"/>
-        <w:rPr>
-          <w:rFonts w:ascii="Calibri" w:hAnsi="Calibri" w:cs="Calibri"/>
-          <w:sz w:val="20"/>
-          <w:szCs w:val="20"/>
-        </w:rPr>
-      </w:pPr>
-    </w:p>
-    <w:p>
-      <w:pPr>
-        <w:jc w:val="both"/>
-        <w:rPr>
-          <w:rFonts w:ascii="Calibri" w:hAnsi="Calibri" w:cs="Calibri"/>
-          <w:sz w:val="20"/>
-          <w:szCs w:val="20"/>
-        </w:rPr>
-      </w:pPr>
-    </w:p>
-    <w:p>
-      <w:pPr>
-        <w:jc w:val="both"/>
-        <w:rPr>
-          <w:rFonts w:ascii="Calibri" w:hAnsi="Calibri" w:cs="Calibri"/>
-          <w:sz w:val="20"/>
-          <w:szCs w:val="20"/>
-        </w:rPr>
-      </w:pPr>
-    </w:p>
-    <w:p>
-      <w:pPr>
-        <w:jc w:val="both"/>
-        <w:rPr>
-          <w:rFonts w:ascii="Calibri" w:hAnsi="Calibri" w:cs="Calibri"/>
-          <w:sz w:val="20"/>
-          <w:szCs w:val="20"/>
-        </w:rPr>
-      </w:pPr>
-    </w:p>
-    <w:p>
-      <w:pPr>
-        <w:jc w:val="both"/>
-        <w:rPr>
-          <w:rFonts w:ascii="Calibri" w:hAnsi="Calibri" w:cs="Calibri"/>
-          <w:sz w:val="20"/>
-          <w:szCs w:val="20"/>
-        </w:rPr>
-      </w:pPr>
-    </w:p>
-    <w:p>
-      <w:pPr>
-        <w:jc w:val="both"/>
-        <w:rPr>
-          <w:rFonts w:ascii="Calibri" w:hAnsi="Calibri" w:cs="Calibri"/>
-          <w:sz w:val="20"/>
-          <w:szCs w:val="20"/>
-        </w:rPr>
-      </w:pPr>
-    </w:p>
-    <w:p>
-      <w:pPr>
-        <w:pStyle w:val="Heading1"/>
+          <w:sz w:val="22"/>
+          <w:szCs w:val="22"/>
+        </w:rPr>
+      </w:pPr>
+    </w:p>
+    <w:p>
+      <w:pPr>
+        <w:jc w:val="both"/>
+        <w:rPr>
+          <w:rFonts w:ascii="Calibri" w:hAnsi="Calibri" w:cs="Calibri"/>
+          <w:sz w:val="22"/>
+          <w:szCs w:val="22"/>
+        </w:rPr>
+      </w:pPr>
+    </w:p>
+    <w:p>
+      <w:pPr>
+        <w:jc w:val="both"/>
+        <w:rPr>
+          <w:rFonts w:ascii="Calibri" w:hAnsi="Calibri" w:cs="Calibri"/>
+          <w:sz w:val="22"/>
+          <w:szCs w:val="22"/>
+        </w:rPr>
+      </w:pPr>
+    </w:p>
+    <w:p>
+      <w:pPr>
+        <w:jc w:val="both"/>
+        <w:rPr>
+          <w:rFonts w:ascii="Calibri" w:hAnsi="Calibri" w:cs="Calibri"/>
+          <w:sz w:val="22"/>
+          <w:szCs w:val="22"/>
+        </w:rPr>
+      </w:pPr>
+    </w:p>
+    <w:p>
+      <w:pPr>
+        <w:jc w:val="both"/>
+        <w:rPr>
+          <w:rFonts w:ascii="Calibri" w:hAnsi="Calibri" w:cs="Calibri"/>
+          <w:sz w:val="22"/>
+          <w:szCs w:val="22"/>
+        </w:rPr>
+      </w:pPr>
+    </w:p>
+    <w:p>
+      <w:pPr>
+        <w:jc w:val="both"/>
+        <w:rPr>
+          <w:rFonts w:ascii="Calibri" w:hAnsi="Calibri" w:cs="Calibri"/>
+          <w:sz w:val="22"/>
+          <w:szCs w:val="22"/>
+        </w:rPr>
+      </w:pPr>
+    </w:p>
+    <w:p>
+      <w:pPr>
+        <w:jc w:val="both"/>
+        <w:rPr>
+          <w:rFonts w:ascii="Calibri" w:hAnsi="Calibri" w:cs="Calibri"/>
+          <w:sz w:val="22"/>
+          <w:szCs w:val="22"/>
+        </w:rPr>
+      </w:pPr>
+    </w:p>
+    <w:p>
+      <w:pPr>
+        <w:jc w:val="both"/>
+        <w:rPr>
+          <w:rFonts w:ascii="Calibri" w:hAnsi="Calibri" w:cs="Calibri"/>
+          <w:sz w:val="22"/>
+          <w:szCs w:val="22"/>
+        </w:rPr>
+      </w:pPr>
+    </w:p>
+    <w:p>
+      <w:pPr>
+        <w:jc w:val="both"/>
+        <w:rPr>
+          <w:rFonts w:ascii="Calibri" w:hAnsi="Calibri" w:cs="Calibri"/>
+          <w:sz w:val="22"/>
+          <w:szCs w:val="22"/>
+        </w:rPr>
+      </w:pPr>
+    </w:p>
+    <w:p>
+      <w:pPr>
+        <w:jc w:val="both"/>
+        <w:rPr>
+          <w:rFonts w:ascii="Calibri" w:hAnsi="Calibri" w:cs="Calibri"/>
+          <w:sz w:val="22"/>
+          <w:szCs w:val="22"/>
+        </w:rPr>
+      </w:pPr>
+    </w:p>
+    <w:p>
+      <w:pPr>
+        <w:jc w:val="both"/>
+        <w:rPr>
+          <w:rFonts w:ascii="Calibri" w:hAnsi="Calibri" w:cs="Calibri"/>
+          <w:sz w:val="22"/>
+          <w:szCs w:val="22"/>
+        </w:rPr>
+      </w:pPr>
+    </w:p>
+    <w:p>
+      <w:pPr>
+        <w:jc w:val="both"/>
+        <w:rPr>
+          <w:rFonts w:ascii="Calibri" w:hAnsi="Calibri" w:cs="Calibri"/>
+          <w:sz w:val="22"/>
+          <w:szCs w:val="22"/>
+        </w:rPr>
+      </w:pPr>
+    </w:p>
+    <w:p>
+      <w:pPr>
+        <w:jc w:val="both"/>
+        <w:rPr>
+          <w:rFonts w:ascii="Calibri" w:hAnsi="Calibri" w:cs="Calibri"/>
+          <w:sz w:val="22"/>
+          <w:szCs w:val="22"/>
+        </w:rPr>
+      </w:pPr>
+    </w:p>
+    <w:p>
+      <w:pPr>
+        <w:pStyle w:val="Ttulo1"/>
         <w:jc w:val="both"/>
         <w:rPr>
           <w:rFonts w:ascii="Calibri" w:hAnsi="Calibri" w:cs="Calibri"/>
@@ -741,7 +1015,6 @@
         <w:rPr>
           <w:rFonts w:ascii="Calibri" w:hAnsi="Calibri" w:cs="Calibri"/>
         </w:rPr>
-        <w:lastRenderedPageBreak/>
         <w:t>3. Criterios de terminado de un elemento</w:t>
       </w:r>
       <w:bookmarkEnd w:id="2"/>
@@ -751,15 +1024,15 @@
         <w:jc w:val="both"/>
         <w:rPr>
           <w:rFonts w:ascii="Calibri" w:hAnsi="Calibri" w:cs="Calibri"/>
-          <w:sz w:val="20"/>
-          <w:szCs w:val="20"/>
+          <w:sz w:val="22"/>
+          <w:szCs w:val="22"/>
         </w:rPr>
       </w:pPr>
       <w:r>
         <w:rPr>
           <w:rFonts w:ascii="Calibri" w:hAnsi="Calibri" w:cs="Calibri"/>
-          <w:sz w:val="20"/>
-          <w:szCs w:val="20"/>
+          <w:sz w:val="22"/>
+          <w:szCs w:val="22"/>
         </w:rPr>
         <w:t>Un elemento del Sprint Backlog se considera terminado cuando cumple todos los criterios de la siguiente tabla:</w:t>
       </w:r>
@@ -799,8 +1072,8 @@
               <w:spacing w:after="40"/>
               <w:rPr>
                 <w:rFonts w:ascii="Calibri" w:hAnsi="Calibri" w:cs="Calibri"/>
-                <w:sz w:val="20"/>
-                <w:szCs w:val="20"/>
+                <w:sz w:val="22"/>
+                <w:szCs w:val="22"/>
               </w:rPr>
             </w:pPr>
             <w:r>
@@ -808,8 +1081,8 @@
                 <w:rFonts w:ascii="Calibri" w:hAnsi="Calibri" w:cs="Calibri"/>
                 <w:b/>
                 <w:bCs/>
-                <w:sz w:val="20"/>
-                <w:szCs w:val="20"/>
+                <w:sz w:val="22"/>
+                <w:szCs w:val="22"/>
               </w:rPr>
               <w:t>N°</w:t>
             </w:r>
@@ -826,8 +1099,8 @@
               <w:spacing w:after="40"/>
               <w:rPr>
                 <w:rFonts w:ascii="Calibri" w:hAnsi="Calibri" w:cs="Calibri"/>
-                <w:sz w:val="20"/>
-                <w:szCs w:val="20"/>
+                <w:sz w:val="22"/>
+                <w:szCs w:val="22"/>
               </w:rPr>
             </w:pPr>
             <w:r>
@@ -835,8 +1108,8 @@
                 <w:rFonts w:ascii="Calibri" w:hAnsi="Calibri" w:cs="Calibri"/>
                 <w:b/>
                 <w:bCs/>
-                <w:sz w:val="20"/>
-                <w:szCs w:val="20"/>
+                <w:sz w:val="22"/>
+                <w:szCs w:val="22"/>
               </w:rPr>
               <w:t>Criterio</w:t>
             </w:r>
@@ -853,8 +1126,8 @@
               <w:spacing w:after="40"/>
               <w:rPr>
                 <w:rFonts w:ascii="Calibri" w:hAnsi="Calibri" w:cs="Calibri"/>
-                <w:sz w:val="20"/>
-                <w:szCs w:val="20"/>
+                <w:sz w:val="22"/>
+                <w:szCs w:val="22"/>
               </w:rPr>
             </w:pPr>
             <w:r>
@@ -862,8 +1135,8 @@
                 <w:rFonts w:ascii="Calibri" w:hAnsi="Calibri" w:cs="Calibri"/>
                 <w:b/>
                 <w:bCs/>
-                <w:sz w:val="20"/>
-                <w:szCs w:val="20"/>
+                <w:sz w:val="22"/>
+                <w:szCs w:val="22"/>
               </w:rPr>
               <w:t>Evidencia</w:t>
             </w:r>
@@ -884,15 +1157,15 @@
               <w:spacing w:after="40"/>
               <w:rPr>
                 <w:rFonts w:ascii="Calibri" w:hAnsi="Calibri" w:cs="Calibri"/>
-                <w:sz w:val="20"/>
-                <w:szCs w:val="20"/>
+                <w:sz w:val="22"/>
+                <w:szCs w:val="22"/>
               </w:rPr>
             </w:pPr>
             <w:r>
               <w:rPr>
                 <w:rFonts w:ascii="Calibri" w:hAnsi="Calibri" w:cs="Calibri"/>
-                <w:sz w:val="20"/>
-                <w:szCs w:val="20"/>
+                <w:sz w:val="22"/>
+                <w:szCs w:val="22"/>
               </w:rPr>
               <w:t>1</w:t>
             </w:r>
@@ -908,15 +1181,15 @@
               <w:spacing w:after="40"/>
               <w:rPr>
                 <w:rFonts w:ascii="Calibri" w:hAnsi="Calibri" w:cs="Calibri"/>
-                <w:sz w:val="20"/>
-                <w:szCs w:val="20"/>
+                <w:sz w:val="22"/>
+                <w:szCs w:val="22"/>
               </w:rPr>
             </w:pPr>
             <w:r>
               <w:rPr>
                 <w:rFonts w:ascii="Calibri" w:hAnsi="Calibri" w:cs="Calibri"/>
-                <w:sz w:val="20"/>
-                <w:szCs w:val="20"/>
+                <w:sz w:val="22"/>
+                <w:szCs w:val="22"/>
               </w:rPr>
               <w:t>Funcionalidad completa: la implementación está terminada y cumple todos los criterios de aceptación definidos en el Product Backlog y en el Sprint Backlog.</w:t>
             </w:r>
@@ -932,15 +1205,15 @@
               <w:spacing w:after="40"/>
               <w:rPr>
                 <w:rFonts w:ascii="Calibri" w:hAnsi="Calibri" w:cs="Calibri"/>
-                <w:sz w:val="20"/>
-                <w:szCs w:val="20"/>
+                <w:sz w:val="22"/>
+                <w:szCs w:val="22"/>
               </w:rPr>
             </w:pPr>
             <w:r>
               <w:rPr>
                 <w:rFonts w:ascii="Calibri" w:hAnsi="Calibri" w:cs="Calibri"/>
-                <w:sz w:val="20"/>
-                <w:szCs w:val="20"/>
+                <w:sz w:val="22"/>
+                <w:szCs w:val="22"/>
               </w:rPr>
               <w:t>Demostración en la Sprint Review.</w:t>
             </w:r>
@@ -961,15 +1234,15 @@
               <w:spacing w:after="40"/>
               <w:rPr>
                 <w:rFonts w:ascii="Calibri" w:hAnsi="Calibri" w:cs="Calibri"/>
-                <w:sz w:val="20"/>
-                <w:szCs w:val="20"/>
+                <w:sz w:val="22"/>
+                <w:szCs w:val="22"/>
               </w:rPr>
             </w:pPr>
             <w:r>
               <w:rPr>
                 <w:rFonts w:ascii="Calibri" w:hAnsi="Calibri" w:cs="Calibri"/>
-                <w:sz w:val="20"/>
-                <w:szCs w:val="20"/>
+                <w:sz w:val="22"/>
+                <w:szCs w:val="22"/>
               </w:rPr>
               <w:t>2</w:t>
             </w:r>
@@ -985,15 +1258,15 @@
               <w:spacing w:after="40"/>
               <w:rPr>
                 <w:rFonts w:ascii="Calibri" w:hAnsi="Calibri" w:cs="Calibri"/>
-                <w:sz w:val="20"/>
-                <w:szCs w:val="20"/>
+                <w:sz w:val="22"/>
+                <w:szCs w:val="22"/>
               </w:rPr>
             </w:pPr>
             <w:r>
               <w:rPr>
                 <w:rFonts w:ascii="Calibri" w:hAnsi="Calibri" w:cs="Calibri"/>
-                <w:sz w:val="20"/>
-                <w:szCs w:val="20"/>
+                <w:sz w:val="22"/>
+                <w:szCs w:val="22"/>
               </w:rPr>
               <w:t>Código versionado: el código se encuentra en el repositorio de GitHub del proyecto, en la rama de desarrollo, con commits descriptivos.</w:t>
             </w:r>
@@ -1009,15 +1282,15 @@
               <w:spacing w:after="40"/>
               <w:rPr>
                 <w:rFonts w:ascii="Calibri" w:hAnsi="Calibri" w:cs="Calibri"/>
-                <w:sz w:val="20"/>
-                <w:szCs w:val="20"/>
+                <w:sz w:val="22"/>
+                <w:szCs w:val="22"/>
               </w:rPr>
             </w:pPr>
             <w:r>
               <w:rPr>
                 <w:rFonts w:ascii="Calibri" w:hAnsi="Calibri" w:cs="Calibri"/>
-                <w:sz w:val="20"/>
-                <w:szCs w:val="20"/>
+                <w:sz w:val="22"/>
+                <w:szCs w:val="22"/>
               </w:rPr>
               <w:t>Historial de commits.</w:t>
             </w:r>
@@ -1038,15 +1311,15 @@
               <w:spacing w:after="40"/>
               <w:rPr>
                 <w:rFonts w:ascii="Calibri" w:hAnsi="Calibri" w:cs="Calibri"/>
-                <w:sz w:val="20"/>
-                <w:szCs w:val="20"/>
+                <w:sz w:val="22"/>
+                <w:szCs w:val="22"/>
               </w:rPr>
             </w:pPr>
             <w:r>
               <w:rPr>
                 <w:rFonts w:ascii="Calibri" w:hAnsi="Calibri" w:cs="Calibri"/>
-                <w:sz w:val="20"/>
-                <w:szCs w:val="20"/>
+                <w:sz w:val="22"/>
+                <w:szCs w:val="22"/>
               </w:rPr>
               <w:t>3</w:t>
             </w:r>
@@ -1062,15 +1335,15 @@
               <w:spacing w:after="40"/>
               <w:rPr>
                 <w:rFonts w:ascii="Calibri" w:hAnsi="Calibri" w:cs="Calibri"/>
-                <w:sz w:val="20"/>
-                <w:szCs w:val="20"/>
+                <w:sz w:val="22"/>
+                <w:szCs w:val="22"/>
               </w:rPr>
             </w:pPr>
             <w:r>
               <w:rPr>
                 <w:rFonts w:ascii="Calibri" w:hAnsi="Calibri" w:cs="Calibri"/>
-                <w:sz w:val="20"/>
-                <w:szCs w:val="20"/>
+                <w:sz w:val="22"/>
+                <w:szCs w:val="22"/>
               </w:rPr>
               <w:t>Revisión del equipo: el otro integrante revisó los cambios antes de integrarlos.</w:t>
             </w:r>
@@ -1086,15 +1359,15 @@
               <w:spacing w:after="40"/>
               <w:rPr>
                 <w:rFonts w:ascii="Calibri" w:hAnsi="Calibri" w:cs="Calibri"/>
-                <w:sz w:val="20"/>
-                <w:szCs w:val="20"/>
+                <w:sz w:val="22"/>
+                <w:szCs w:val="22"/>
               </w:rPr>
             </w:pPr>
             <w:r>
               <w:rPr>
                 <w:rFonts w:ascii="Calibri" w:hAnsi="Calibri" w:cs="Calibri"/>
-                <w:sz w:val="20"/>
-                <w:szCs w:val="20"/>
+                <w:sz w:val="22"/>
+                <w:szCs w:val="22"/>
               </w:rPr>
               <w:t>Revisión registrada (pull request o comentario).</w:t>
             </w:r>
@@ -1115,15 +1388,15 @@
               <w:spacing w:after="40"/>
               <w:rPr>
                 <w:rFonts w:ascii="Calibri" w:hAnsi="Calibri" w:cs="Calibri"/>
-                <w:sz w:val="20"/>
-                <w:szCs w:val="20"/>
+                <w:sz w:val="22"/>
+                <w:szCs w:val="22"/>
               </w:rPr>
             </w:pPr>
             <w:r>
               <w:rPr>
                 <w:rFonts w:ascii="Calibri" w:hAnsi="Calibri" w:cs="Calibri"/>
-                <w:sz w:val="20"/>
-                <w:szCs w:val="20"/>
+                <w:sz w:val="22"/>
+                <w:szCs w:val="22"/>
               </w:rPr>
               <w:t>4</w:t>
             </w:r>
@@ -1139,15 +1412,15 @@
               <w:spacing w:after="40"/>
               <w:rPr>
                 <w:rFonts w:ascii="Calibri" w:hAnsi="Calibri" w:cs="Calibri"/>
-                <w:sz w:val="20"/>
-                <w:szCs w:val="20"/>
+                <w:sz w:val="22"/>
+                <w:szCs w:val="22"/>
               </w:rPr>
             </w:pPr>
             <w:r>
               <w:rPr>
                 <w:rFonts w:ascii="Calibri" w:hAnsi="Calibri" w:cs="Calibri"/>
-                <w:sz w:val="20"/>
-                <w:szCs w:val="20"/>
+                <w:sz w:val="22"/>
+                <w:szCs w:val="22"/>
               </w:rPr>
               <w:t>Pruebas ejecutadas: las pruebas planificadas para el elemento se ejecutaron, sus resultados quedaron registrados y las pruebas existentes siguen funcionando.</w:t>
             </w:r>
@@ -1163,15 +1436,15 @@
               <w:spacing w:after="40"/>
               <w:rPr>
                 <w:rFonts w:ascii="Calibri" w:hAnsi="Calibri" w:cs="Calibri"/>
-                <w:sz w:val="20"/>
-                <w:szCs w:val="20"/>
+                <w:sz w:val="22"/>
+                <w:szCs w:val="22"/>
               </w:rPr>
             </w:pPr>
             <w:r>
               <w:rPr>
                 <w:rFonts w:ascii="Calibri" w:hAnsi="Calibri" w:cs="Calibri"/>
-                <w:sz w:val="20"/>
-                <w:szCs w:val="20"/>
+                <w:sz w:val="22"/>
+                <w:szCs w:val="22"/>
               </w:rPr>
               <w:t>Registro de pruebas.</w:t>
             </w:r>
@@ -1192,17 +1465,17 @@
               <w:spacing w:after="40"/>
               <w:rPr>
                 <w:rFonts w:ascii="Calibri" w:hAnsi="Calibri" w:cs="Calibri"/>
-                <w:sz w:val="20"/>
-                <w:szCs w:val="20"/>
+                <w:sz w:val="22"/>
+                <w:szCs w:val="22"/>
               </w:rPr>
             </w:pPr>
             <w:r>
               <w:rPr>
                 <w:rFonts w:ascii="Calibri" w:hAnsi="Calibri" w:cs="Calibri"/>
-                <w:sz w:val="20"/>
-                <w:szCs w:val="20"/>
-              </w:rPr>
-              <w:t xml:space="preserve">5</w:t>
+                <w:sz w:val="22"/>
+                <w:szCs w:val="22"/>
+              </w:rPr>
+              <w:t>5</w:t>
             </w:r>
           </w:p>
         </w:tc>
@@ -1216,17 +1489,17 @@
               <w:spacing w:after="40"/>
               <w:rPr>
                 <w:rFonts w:ascii="Calibri" w:hAnsi="Calibri" w:cs="Calibri"/>
-                <w:sz w:val="20"/>
-                <w:szCs w:val="20"/>
+                <w:sz w:val="22"/>
+                <w:szCs w:val="22"/>
               </w:rPr>
             </w:pPr>
             <w:r>
               <w:rPr>
                 <w:rFonts w:ascii="Calibri" w:hAnsi="Calibri" w:cs="Calibri"/>
-                <w:sz w:val="20"/>
-                <w:szCs w:val="20"/>
-              </w:rPr>
-              <w:t xml:space="preserve">Sin errores críticos: no existen errores críticos abiertos asociados al elemento.</w:t>
+                <w:sz w:val="22"/>
+                <w:szCs w:val="22"/>
+              </w:rPr>
+              <w:t>Sin errores críticos: no existen errores críticos abiertos asociados al elemento.</w:t>
             </w:r>
           </w:p>
         </w:tc>
@@ -1240,17 +1513,17 @@
               <w:spacing w:after="40"/>
               <w:rPr>
                 <w:rFonts w:ascii="Calibri" w:hAnsi="Calibri" w:cs="Calibri"/>
-                <w:sz w:val="20"/>
-                <w:szCs w:val="20"/>
+                <w:sz w:val="22"/>
+                <w:szCs w:val="22"/>
               </w:rPr>
             </w:pPr>
             <w:r>
               <w:rPr>
                 <w:rFonts w:ascii="Calibri" w:hAnsi="Calibri" w:cs="Calibri"/>
-                <w:sz w:val="20"/>
-                <w:szCs w:val="20"/>
-              </w:rPr>
-              <w:t xml:space="preserve">Documento Registro de errores.</w:t>
+                <w:sz w:val="22"/>
+                <w:szCs w:val="22"/>
+              </w:rPr>
+              <w:t>Documento Registro de errores.</w:t>
             </w:r>
           </w:p>
         </w:tc>
@@ -1269,15 +1542,15 @@
               <w:spacing w:after="40"/>
               <w:rPr>
                 <w:rFonts w:ascii="Calibri" w:hAnsi="Calibri" w:cs="Calibri"/>
-                <w:sz w:val="20"/>
-                <w:szCs w:val="20"/>
+                <w:sz w:val="22"/>
+                <w:szCs w:val="22"/>
               </w:rPr>
             </w:pPr>
             <w:r>
               <w:rPr>
                 <w:rFonts w:ascii="Calibri" w:hAnsi="Calibri" w:cs="Calibri"/>
-                <w:sz w:val="20"/>
-                <w:szCs w:val="20"/>
+                <w:sz w:val="22"/>
+                <w:szCs w:val="22"/>
               </w:rPr>
               <w:t>6</w:t>
             </w:r>
@@ -1293,15 +1566,15 @@
               <w:spacing w:after="40"/>
               <w:rPr>
                 <w:rFonts w:ascii="Calibri" w:hAnsi="Calibri" w:cs="Calibri"/>
-                <w:sz w:val="20"/>
-                <w:szCs w:val="20"/>
+                <w:sz w:val="22"/>
+                <w:szCs w:val="22"/>
               </w:rPr>
             </w:pPr>
             <w:r>
               <w:rPr>
                 <w:rFonts w:ascii="Calibri" w:hAnsi="Calibri" w:cs="Calibri"/>
-                <w:sz w:val="20"/>
-                <w:szCs w:val="20"/>
+                <w:sz w:val="22"/>
+                <w:szCs w:val="22"/>
               </w:rPr>
               <w:t>Integración: el elemento está integrado con los componentes correspondientes y no impide el funcionamiento del incremento.</w:t>
             </w:r>
@@ -1317,15 +1590,15 @@
               <w:spacing w:after="40"/>
               <w:rPr>
                 <w:rFonts w:ascii="Calibri" w:hAnsi="Calibri" w:cs="Calibri"/>
-                <w:sz w:val="20"/>
-                <w:szCs w:val="20"/>
+                <w:sz w:val="22"/>
+                <w:szCs w:val="22"/>
               </w:rPr>
             </w:pPr>
             <w:r>
               <w:rPr>
                 <w:rFonts w:ascii="Calibri" w:hAnsi="Calibri" w:cs="Calibri"/>
-                <w:sz w:val="20"/>
-                <w:szCs w:val="20"/>
+                <w:sz w:val="22"/>
+                <w:szCs w:val="22"/>
               </w:rPr>
               <w:t>Ejecución del incremento completo.</w:t>
             </w:r>
@@ -1346,15 +1619,15 @@
               <w:spacing w:after="40"/>
               <w:rPr>
                 <w:rFonts w:ascii="Calibri" w:hAnsi="Calibri" w:cs="Calibri"/>
-                <w:sz w:val="20"/>
-                <w:szCs w:val="20"/>
+                <w:sz w:val="22"/>
+                <w:szCs w:val="22"/>
               </w:rPr>
             </w:pPr>
             <w:r>
               <w:rPr>
                 <w:rFonts w:ascii="Calibri" w:hAnsi="Calibri" w:cs="Calibri"/>
-                <w:sz w:val="20"/>
-                <w:szCs w:val="20"/>
+                <w:sz w:val="22"/>
+                <w:szCs w:val="22"/>
               </w:rPr>
               <w:t>7</w:t>
             </w:r>
@@ -1370,15 +1643,15 @@
               <w:spacing w:after="40"/>
               <w:rPr>
                 <w:rFonts w:ascii="Calibri" w:hAnsi="Calibri" w:cs="Calibri"/>
-                <w:sz w:val="20"/>
-                <w:szCs w:val="20"/>
+                <w:sz w:val="22"/>
+                <w:szCs w:val="22"/>
               </w:rPr>
             </w:pPr>
             <w:r>
               <w:rPr>
                 <w:rFonts w:ascii="Calibri" w:hAnsi="Calibri" w:cs="Calibri"/>
-                <w:sz w:val="20"/>
-                <w:szCs w:val="20"/>
+                <w:sz w:val="22"/>
+                <w:szCs w:val="22"/>
               </w:rPr>
               <w:t>Seguridad: en los elementos que involucran el servidor, la API exige un token válido, las contraseñas se almacenan solo como hash y las credenciales no se incluyen en el código fuente.</w:t>
             </w:r>
@@ -1394,15 +1667,15 @@
               <w:spacing w:after="40"/>
               <w:rPr>
                 <w:rFonts w:ascii="Calibri" w:hAnsi="Calibri" w:cs="Calibri"/>
-                <w:sz w:val="20"/>
-                <w:szCs w:val="20"/>
+                <w:sz w:val="22"/>
+                <w:szCs w:val="22"/>
               </w:rPr>
             </w:pPr>
             <w:r>
               <w:rPr>
                 <w:rFonts w:ascii="Calibri" w:hAnsi="Calibri" w:cs="Calibri"/>
-                <w:sz w:val="20"/>
-                <w:szCs w:val="20"/>
+                <w:sz w:val="22"/>
+                <w:szCs w:val="22"/>
               </w:rPr>
               <w:t>Pruebas de acceso sin token y revisión del código.</w:t>
             </w:r>
@@ -1423,15 +1696,15 @@
               <w:spacing w:after="40"/>
               <w:rPr>
                 <w:rFonts w:ascii="Calibri" w:hAnsi="Calibri" w:cs="Calibri"/>
-                <w:sz w:val="20"/>
-                <w:szCs w:val="20"/>
+                <w:sz w:val="22"/>
+                <w:szCs w:val="22"/>
               </w:rPr>
             </w:pPr>
             <w:r>
               <w:rPr>
                 <w:rFonts w:ascii="Calibri" w:hAnsi="Calibri" w:cs="Calibri"/>
-                <w:sz w:val="20"/>
-                <w:szCs w:val="20"/>
+                <w:sz w:val="22"/>
+                <w:szCs w:val="22"/>
               </w:rPr>
               <w:t>8</w:t>
             </w:r>
@@ -1447,15 +1720,15 @@
               <w:spacing w:after="40"/>
               <w:rPr>
                 <w:rFonts w:ascii="Calibri" w:hAnsi="Calibri" w:cs="Calibri"/>
-                <w:sz w:val="20"/>
-                <w:szCs w:val="20"/>
+                <w:sz w:val="22"/>
+                <w:szCs w:val="22"/>
               </w:rPr>
             </w:pPr>
             <w:r>
               <w:rPr>
                 <w:rFonts w:ascii="Calibri" w:hAnsi="Calibri" w:cs="Calibri"/>
-                <w:sz w:val="20"/>
-                <w:szCs w:val="20"/>
+                <w:sz w:val="22"/>
+                <w:szCs w:val="22"/>
               </w:rPr>
               <w:t>Modelo de datos: los cambios en la base de datos respetan el modelo definido en el Product Backlog; si el modelo cambia, su documentación se actualiza.</w:t>
             </w:r>
@@ -1471,15 +1744,15 @@
               <w:spacing w:after="40"/>
               <w:rPr>
                 <w:rFonts w:ascii="Calibri" w:hAnsi="Calibri" w:cs="Calibri"/>
-                <w:sz w:val="20"/>
-                <w:szCs w:val="20"/>
+                <w:sz w:val="22"/>
+                <w:szCs w:val="22"/>
               </w:rPr>
             </w:pPr>
             <w:r>
               <w:rPr>
                 <w:rFonts w:ascii="Calibri" w:hAnsi="Calibri" w:cs="Calibri"/>
-                <w:sz w:val="20"/>
-                <w:szCs w:val="20"/>
+                <w:sz w:val="22"/>
+                <w:szCs w:val="22"/>
               </w:rPr>
               <w:t>Modelo de datos actualizado.</w:t>
             </w:r>
@@ -1500,15 +1773,15 @@
               <w:spacing w:after="40"/>
               <w:rPr>
                 <w:rFonts w:ascii="Calibri" w:hAnsi="Calibri" w:cs="Calibri"/>
-                <w:sz w:val="20"/>
-                <w:szCs w:val="20"/>
+                <w:sz w:val="22"/>
+                <w:szCs w:val="22"/>
               </w:rPr>
             </w:pPr>
             <w:r>
               <w:rPr>
                 <w:rFonts w:ascii="Calibri" w:hAnsi="Calibri" w:cs="Calibri"/>
-                <w:sz w:val="20"/>
-                <w:szCs w:val="20"/>
+                <w:sz w:val="22"/>
+                <w:szCs w:val="22"/>
               </w:rPr>
               <w:t>9</w:t>
             </w:r>
@@ -1524,15 +1797,15 @@
               <w:spacing w:after="40"/>
               <w:rPr>
                 <w:rFonts w:ascii="Calibri" w:hAnsi="Calibri" w:cs="Calibri"/>
-                <w:sz w:val="20"/>
-                <w:szCs w:val="20"/>
+                <w:sz w:val="22"/>
+                <w:szCs w:val="22"/>
               </w:rPr>
             </w:pPr>
             <w:r>
               <w:rPr>
                 <w:rFonts w:ascii="Calibri" w:hAnsi="Calibri" w:cs="Calibri"/>
-                <w:sz w:val="20"/>
-                <w:szCs w:val="20"/>
+                <w:sz w:val="22"/>
+                <w:szCs w:val="22"/>
               </w:rPr>
               <w:t>Documentación: la documentación afectada por el elemento (README, manual técnico, arquitectura o modelo de datos) se encuentra actualizada.</w:t>
             </w:r>
@@ -1548,15 +1821,15 @@
               <w:spacing w:after="40"/>
               <w:rPr>
                 <w:rFonts w:ascii="Calibri" w:hAnsi="Calibri" w:cs="Calibri"/>
-                <w:sz w:val="20"/>
-                <w:szCs w:val="20"/>
+                <w:sz w:val="22"/>
+                <w:szCs w:val="22"/>
               </w:rPr>
             </w:pPr>
             <w:r>
               <w:rPr>
                 <w:rFonts w:ascii="Calibri" w:hAnsi="Calibri" w:cs="Calibri"/>
-                <w:sz w:val="20"/>
-                <w:szCs w:val="20"/>
+                <w:sz w:val="22"/>
+                <w:szCs w:val="22"/>
               </w:rPr>
               <w:t>Documentos actualizados en el repositorio.</w:t>
             </w:r>
@@ -1577,15 +1850,15 @@
               <w:spacing w:after="40"/>
               <w:rPr>
                 <w:rFonts w:ascii="Calibri" w:hAnsi="Calibri" w:cs="Calibri"/>
-                <w:sz w:val="20"/>
-                <w:szCs w:val="20"/>
+                <w:sz w:val="22"/>
+                <w:szCs w:val="22"/>
               </w:rPr>
             </w:pPr>
             <w:r>
               <w:rPr>
                 <w:rFonts w:ascii="Calibri" w:hAnsi="Calibri" w:cs="Calibri"/>
-                <w:sz w:val="20"/>
-                <w:szCs w:val="20"/>
+                <w:sz w:val="22"/>
+                <w:szCs w:val="22"/>
               </w:rPr>
               <w:t>10</w:t>
             </w:r>
@@ -1601,15 +1874,15 @@
               <w:spacing w:after="40"/>
               <w:rPr>
                 <w:rFonts w:ascii="Calibri" w:hAnsi="Calibri" w:cs="Calibri"/>
-                <w:sz w:val="20"/>
-                <w:szCs w:val="20"/>
+                <w:sz w:val="22"/>
+                <w:szCs w:val="22"/>
               </w:rPr>
             </w:pPr>
             <w:r>
               <w:rPr>
                 <w:rFonts w:ascii="Calibri" w:hAnsi="Calibri" w:cs="Calibri"/>
-                <w:sz w:val="20"/>
-                <w:szCs w:val="20"/>
+                <w:sz w:val="22"/>
+                <w:szCs w:val="22"/>
               </w:rPr>
               <w:t>Estado actualizado: el elemento figura como terminado en el Sprint Backlog.</w:t>
             </w:r>
@@ -1625,15 +1898,15 @@
               <w:spacing w:after="40"/>
               <w:rPr>
                 <w:rFonts w:ascii="Calibri" w:hAnsi="Calibri" w:cs="Calibri"/>
-                <w:sz w:val="20"/>
-                <w:szCs w:val="20"/>
+                <w:sz w:val="22"/>
+                <w:szCs w:val="22"/>
               </w:rPr>
             </w:pPr>
             <w:r>
               <w:rPr>
                 <w:rFonts w:ascii="Calibri" w:hAnsi="Calibri" w:cs="Calibri"/>
-                <w:sz w:val="20"/>
-                <w:szCs w:val="20"/>
+                <w:sz w:val="22"/>
+                <w:szCs w:val="22"/>
               </w:rPr>
               <w:t>Sprint Backlog actualizado.</w:t>
             </w:r>
@@ -1646,25 +1919,25 @@
         <w:jc w:val="both"/>
         <w:rPr>
           <w:rFonts w:ascii="Calibri" w:hAnsi="Calibri" w:cs="Calibri"/>
-          <w:sz w:val="20"/>
-          <w:szCs w:val="20"/>
-        </w:rPr>
-      </w:pPr>
-    </w:p>
-    <w:p>
-      <w:pPr>
-        <w:jc w:val="both"/>
-        <w:rPr>
-          <w:rFonts w:ascii="Calibri" w:hAnsi="Calibri" w:cs="Calibri"/>
-          <w:sz w:val="20"/>
-          <w:szCs w:val="20"/>
+          <w:sz w:val="22"/>
+          <w:szCs w:val="22"/>
+        </w:rPr>
+      </w:pPr>
+    </w:p>
+    <w:p>
+      <w:pPr>
+        <w:jc w:val="both"/>
+        <w:rPr>
+          <w:rFonts w:ascii="Calibri" w:hAnsi="Calibri" w:cs="Calibri"/>
+          <w:sz w:val="22"/>
+          <w:szCs w:val="22"/>
         </w:rPr>
       </w:pPr>
       <w:r>
         <w:rPr>
           <w:rFonts w:ascii="Calibri" w:hAnsi="Calibri" w:cs="Calibri"/>
-          <w:sz w:val="20"/>
-          <w:szCs w:val="20"/>
+          <w:sz w:val="22"/>
+          <w:szCs w:val="22"/>
         </w:rPr>
         <w:t>Escribir el código de una funcionalidad no basta para considerarla terminada: debe cumplir todos los criterios anteriores.</w:t>
       </w:r>
@@ -1674,14 +1947,14 @@
         <w:jc w:val="both"/>
         <w:rPr>
           <w:rFonts w:ascii="Calibri" w:hAnsi="Calibri" w:cs="Calibri"/>
-          <w:sz w:val="20"/>
-          <w:szCs w:val="20"/>
-        </w:rPr>
-      </w:pPr>
-    </w:p>
-    <w:p>
-      <w:pPr>
-        <w:pStyle w:val="Heading1"/>
+          <w:sz w:val="22"/>
+          <w:szCs w:val="22"/>
+        </w:rPr>
+      </w:pPr>
+    </w:p>
+    <w:p>
+      <w:pPr>
+        <w:pStyle w:val="Ttulo1"/>
         <w:jc w:val="both"/>
         <w:rPr>
           <w:rFonts w:ascii="Calibri" w:hAnsi="Calibri" w:cs="Calibri"/>
@@ -1701,15 +1974,15 @@
         <w:jc w:val="both"/>
         <w:rPr>
           <w:rFonts w:ascii="Calibri" w:hAnsi="Calibri" w:cs="Calibri"/>
-          <w:sz w:val="20"/>
-          <w:szCs w:val="20"/>
+          <w:sz w:val="22"/>
+          <w:szCs w:val="22"/>
         </w:rPr>
       </w:pPr>
       <w:r>
         <w:rPr>
           <w:rFonts w:ascii="Calibri" w:hAnsi="Calibri" w:cs="Calibri"/>
-          <w:sz w:val="20"/>
-          <w:szCs w:val="20"/>
+          <w:sz w:val="22"/>
+          <w:szCs w:val="22"/>
         </w:rPr>
         <w:t>Un Sprint se considera terminado cuando:</w:t>
       </w:r>
@@ -1723,15 +1996,15 @@
         <w:jc w:val="both"/>
         <w:rPr>
           <w:rFonts w:ascii="Calibri" w:hAnsi="Calibri" w:cs="Calibri"/>
-          <w:sz w:val="20"/>
-          <w:szCs w:val="20"/>
+          <w:sz w:val="22"/>
+          <w:szCs w:val="22"/>
         </w:rPr>
       </w:pPr>
       <w:r>
         <w:rPr>
           <w:rFonts w:ascii="Calibri" w:hAnsi="Calibri" w:cs="Calibri"/>
-          <w:sz w:val="20"/>
-          <w:szCs w:val="20"/>
+          <w:sz w:val="22"/>
+          <w:szCs w:val="22"/>
         </w:rPr>
         <w:t>Todos los elementos comprometidos cumplen la Definition of Done o fueron devueltos al Product Backlog con su justificación.</w:t>
       </w:r>
@@ -1745,17 +2018,16 @@
         <w:jc w:val="both"/>
         <w:rPr>
           <w:rFonts w:ascii="Calibri" w:hAnsi="Calibri" w:cs="Calibri"/>
-          <w:sz w:val="20"/>
-          <w:szCs w:val="20"/>
+          <w:sz w:val="22"/>
+          <w:szCs w:val="22"/>
         </w:rPr>
       </w:pPr>
       <w:r>
         <w:rPr>
           <w:rFonts w:ascii="Calibri" w:hAnsi="Calibri" w:cs="Calibri"/>
-          <w:sz w:val="20"/>
-          <w:szCs w:val="20"/>
-        </w:rPr>
-        <w:lastRenderedPageBreak/>
+          <w:sz w:val="22"/>
+          <w:szCs w:val="22"/>
+        </w:rPr>
         <w:t>El incremento se puede ejecutar de forma completa y fue demostrado en la Sprint Review.</w:t>
       </w:r>
     </w:p>
@@ -1768,15 +2040,15 @@
         <w:jc w:val="both"/>
         <w:rPr>
           <w:rFonts w:ascii="Calibri" w:hAnsi="Calibri" w:cs="Calibri"/>
-          <w:sz w:val="20"/>
-          <w:szCs w:val="20"/>
+          <w:sz w:val="22"/>
+          <w:szCs w:val="22"/>
         </w:rPr>
       </w:pPr>
       <w:r>
         <w:rPr>
           <w:rFonts w:ascii="Calibri" w:hAnsi="Calibri" w:cs="Calibri"/>
-          <w:sz w:val="20"/>
-          <w:szCs w:val="20"/>
+          <w:sz w:val="22"/>
+          <w:szCs w:val="22"/>
         </w:rPr>
         <w:t>Se realizó la Sprint Retrospective y quedó registrada utilizando la plantilla de retrospectiva del proyecto.</w:t>
       </w:r>
@@ -1790,15 +2062,15 @@
         <w:jc w:val="both"/>
         <w:rPr>
           <w:rFonts w:ascii="Calibri" w:hAnsi="Calibri" w:cs="Calibri"/>
-          <w:sz w:val="20"/>
-          <w:szCs w:val="20"/>
+          <w:sz w:val="22"/>
+          <w:szCs w:val="22"/>
         </w:rPr>
       </w:pPr>
       <w:r>
         <w:rPr>
           <w:rFonts w:ascii="Calibri" w:hAnsi="Calibri" w:cs="Calibri"/>
-          <w:sz w:val="20"/>
-          <w:szCs w:val="20"/>
+          <w:sz w:val="22"/>
+          <w:szCs w:val="22"/>
         </w:rPr>
         <w:t>El Sprint Backlog refleja el estado final de cada tarea.</w:t>
       </w:r>
@@ -1812,15 +2084,15 @@
         <w:jc w:val="both"/>
         <w:rPr>
           <w:rFonts w:ascii="Calibri" w:hAnsi="Calibri" w:cs="Calibri"/>
-          <w:sz w:val="20"/>
-          <w:szCs w:val="20"/>
+          <w:sz w:val="22"/>
+          <w:szCs w:val="22"/>
         </w:rPr>
       </w:pPr>
       <w:r>
         <w:rPr>
           <w:rFonts w:ascii="Calibri" w:hAnsi="Calibri" w:cs="Calibri"/>
-          <w:sz w:val="20"/>
-          <w:szCs w:val="20"/>
+          <w:sz w:val="22"/>
+          <w:szCs w:val="22"/>
         </w:rPr>
         <w:t>Los cambios del Sprint se encuentran integrados en el repositorio del proyecto.</w:t>
       </w:r>
@@ -1830,14 +2102,14 @@
         <w:jc w:val="both"/>
         <w:rPr>
           <w:rFonts w:ascii="Calibri" w:hAnsi="Calibri" w:cs="Calibri"/>
-          <w:sz w:val="20"/>
-          <w:szCs w:val="20"/>
-        </w:rPr>
-      </w:pPr>
-    </w:p>
-    <w:p>
-      <w:pPr>
-        <w:pStyle w:val="Heading1"/>
+          <w:sz w:val="22"/>
+          <w:szCs w:val="22"/>
+        </w:rPr>
+      </w:pPr>
+    </w:p>
+    <w:p>
+      <w:pPr>
+        <w:pStyle w:val="Ttulo1"/>
         <w:jc w:val="both"/>
         <w:rPr>
           <w:rFonts w:ascii="Calibri" w:hAnsi="Calibri" w:cs="Calibri"/>
@@ -1857,15 +2129,15 @@
         <w:jc w:val="both"/>
         <w:rPr>
           <w:rFonts w:ascii="Calibri" w:hAnsi="Calibri" w:cs="Calibri"/>
-          <w:sz w:val="20"/>
-          <w:szCs w:val="20"/>
+          <w:sz w:val="22"/>
+          <w:szCs w:val="22"/>
         </w:rPr>
       </w:pPr>
       <w:r>
         <w:rPr>
           <w:rFonts w:ascii="Calibri" w:hAnsi="Calibri" w:cs="Calibri"/>
-          <w:sz w:val="20"/>
-          <w:szCs w:val="20"/>
+          <w:sz w:val="22"/>
+          <w:szCs w:val="22"/>
         </w:rPr>
         <w:t>La Definition of Done se utiliza en cada evento de Scrum:</w:t>
       </w:r>
@@ -1879,15 +2151,15 @@
         <w:jc w:val="both"/>
         <w:rPr>
           <w:rFonts w:ascii="Calibri" w:hAnsi="Calibri" w:cs="Calibri"/>
-          <w:sz w:val="20"/>
-          <w:szCs w:val="20"/>
+          <w:sz w:val="22"/>
+          <w:szCs w:val="22"/>
         </w:rPr>
       </w:pPr>
       <w:r>
         <w:rPr>
           <w:rFonts w:ascii="Calibri" w:hAnsi="Calibri" w:cs="Calibri"/>
-          <w:sz w:val="20"/>
-          <w:szCs w:val="20"/>
+          <w:sz w:val="22"/>
+          <w:szCs w:val="22"/>
         </w:rPr>
         <w:t>Sprint Planning: al seleccionar los elementos del Sprint, el equipo considera el trabajo necesario para cumplir la Definition of Done, y no solo el necesario para programar la funcionalidad.</w:t>
       </w:r>
@@ -1901,15 +2173,15 @@
         <w:jc w:val="both"/>
         <w:rPr>
           <w:rFonts w:ascii="Calibri" w:hAnsi="Calibri" w:cs="Calibri"/>
-          <w:sz w:val="20"/>
-          <w:szCs w:val="20"/>
+          <w:sz w:val="22"/>
+          <w:szCs w:val="22"/>
         </w:rPr>
       </w:pPr>
       <w:r>
         <w:rPr>
           <w:rFonts w:ascii="Calibri" w:hAnsi="Calibri" w:cs="Calibri"/>
-          <w:sz w:val="20"/>
-          <w:szCs w:val="20"/>
+          <w:sz w:val="22"/>
+          <w:szCs w:val="22"/>
         </w:rPr>
         <w:t>Daily Scrum: el equipo revisa qué condiciones faltan para terminar cada elemento en curso.</w:t>
       </w:r>
@@ -1923,15 +2195,15 @@
         <w:jc w:val="both"/>
         <w:rPr>
           <w:rFonts w:ascii="Calibri" w:hAnsi="Calibri" w:cs="Calibri"/>
-          <w:sz w:val="20"/>
-          <w:szCs w:val="20"/>
+          <w:sz w:val="22"/>
+          <w:szCs w:val="22"/>
         </w:rPr>
       </w:pPr>
       <w:r>
         <w:rPr>
           <w:rFonts w:ascii="Calibri" w:hAnsi="Calibri" w:cs="Calibri"/>
-          <w:sz w:val="20"/>
-          <w:szCs w:val="20"/>
+          <w:sz w:val="22"/>
+          <w:szCs w:val="22"/>
         </w:rPr>
         <w:t>Sprint Review: solo se presentan como completados los elementos que cumplen todos los criterios.</w:t>
       </w:r>
@@ -1945,15 +2217,15 @@
         <w:jc w:val="both"/>
         <w:rPr>
           <w:rFonts w:ascii="Calibri" w:hAnsi="Calibri" w:cs="Calibri"/>
-          <w:sz w:val="20"/>
-          <w:szCs w:val="20"/>
+          <w:sz w:val="22"/>
+          <w:szCs w:val="22"/>
         </w:rPr>
       </w:pPr>
       <w:r>
         <w:rPr>
           <w:rFonts w:ascii="Calibri" w:hAnsi="Calibri" w:cs="Calibri"/>
-          <w:sz w:val="20"/>
-          <w:szCs w:val="20"/>
+          <w:sz w:val="22"/>
+          <w:szCs w:val="22"/>
         </w:rPr>
         <w:t>Sprint Retrospective: el equipo evalúa si la Definition of Done fue adecuada y, si corresponde, la ajusta para el Sprint siguiente.</w:t>
       </w:r>
@@ -1963,14 +2235,14 @@
         <w:jc w:val="both"/>
         <w:rPr>
           <w:rFonts w:ascii="Calibri" w:hAnsi="Calibri" w:cs="Calibri"/>
-          <w:sz w:val="20"/>
-          <w:szCs w:val="20"/>
-        </w:rPr>
-      </w:pPr>
-    </w:p>
-    <w:p>
-      <w:pPr>
-        <w:pStyle w:val="Heading1"/>
+          <w:sz w:val="22"/>
+          <w:szCs w:val="22"/>
+        </w:rPr>
+      </w:pPr>
+    </w:p>
+    <w:p>
+      <w:pPr>
+        <w:pStyle w:val="Ttulo1"/>
         <w:jc w:val="both"/>
         <w:rPr>
           <w:rFonts w:ascii="Calibri" w:hAnsi="Calibri" w:cs="Calibri"/>
@@ -1990,15 +2262,15 @@
         <w:jc w:val="both"/>
         <w:rPr>
           <w:rFonts w:ascii="Calibri" w:hAnsi="Calibri" w:cs="Calibri"/>
-          <w:sz w:val="20"/>
-          <w:szCs w:val="20"/>
+          <w:sz w:val="22"/>
+          <w:szCs w:val="22"/>
         </w:rPr>
       </w:pPr>
       <w:r>
         <w:rPr>
           <w:rFonts w:ascii="Calibri" w:hAnsi="Calibri" w:cs="Calibri"/>
-          <w:sz w:val="20"/>
-          <w:szCs w:val="20"/>
+          <w:sz w:val="22"/>
+          <w:szCs w:val="22"/>
         </w:rPr>
         <w:t>Cualquier ajuste a la Definition of Done se acuerda en la Sprint Retrospective y se registra en la siguiente tabla:</w:t>
       </w:r>
@@ -2039,8 +2311,8 @@
               <w:spacing w:after="40"/>
               <w:rPr>
                 <w:rFonts w:ascii="Calibri" w:hAnsi="Calibri" w:cs="Calibri"/>
-                <w:sz w:val="20"/>
-                <w:szCs w:val="20"/>
+                <w:sz w:val="22"/>
+                <w:szCs w:val="22"/>
               </w:rPr>
             </w:pPr>
             <w:r>
@@ -2048,8 +2320,8 @@
                 <w:rFonts w:ascii="Calibri" w:hAnsi="Calibri" w:cs="Calibri"/>
                 <w:b/>
                 <w:bCs/>
-                <w:sz w:val="20"/>
-                <w:szCs w:val="20"/>
+                <w:sz w:val="22"/>
+                <w:szCs w:val="22"/>
               </w:rPr>
               <w:t>Versión</w:t>
             </w:r>
@@ -2066,8 +2338,8 @@
               <w:spacing w:after="40"/>
               <w:rPr>
                 <w:rFonts w:ascii="Calibri" w:hAnsi="Calibri" w:cs="Calibri"/>
-                <w:sz w:val="20"/>
-                <w:szCs w:val="20"/>
+                <w:sz w:val="22"/>
+                <w:szCs w:val="22"/>
               </w:rPr>
             </w:pPr>
             <w:r>
@@ -2075,8 +2347,8 @@
                 <w:rFonts w:ascii="Calibri" w:hAnsi="Calibri" w:cs="Calibri"/>
                 <w:b/>
                 <w:bCs/>
-                <w:sz w:val="20"/>
-                <w:szCs w:val="20"/>
+                <w:sz w:val="22"/>
+                <w:szCs w:val="22"/>
               </w:rPr>
               <w:t>Fecha</w:t>
             </w:r>
@@ -2093,8 +2365,8 @@
               <w:spacing w:after="40"/>
               <w:rPr>
                 <w:rFonts w:ascii="Calibri" w:hAnsi="Calibri" w:cs="Calibri"/>
-                <w:sz w:val="20"/>
-                <w:szCs w:val="20"/>
+                <w:sz w:val="22"/>
+                <w:szCs w:val="22"/>
               </w:rPr>
             </w:pPr>
             <w:r>
@@ -2102,8 +2374,8 @@
                 <w:rFonts w:ascii="Calibri" w:hAnsi="Calibri" w:cs="Calibri"/>
                 <w:b/>
                 <w:bCs/>
-                <w:sz w:val="20"/>
-                <w:szCs w:val="20"/>
+                <w:sz w:val="22"/>
+                <w:szCs w:val="22"/>
               </w:rPr>
               <w:t>Descripción del cambio</w:t>
             </w:r>
@@ -2120,8 +2392,8 @@
               <w:spacing w:after="40"/>
               <w:rPr>
                 <w:rFonts w:ascii="Calibri" w:hAnsi="Calibri" w:cs="Calibri"/>
-                <w:sz w:val="20"/>
-                <w:szCs w:val="20"/>
+                <w:sz w:val="22"/>
+                <w:szCs w:val="22"/>
               </w:rPr>
             </w:pPr>
             <w:r>
@@ -2129,8 +2401,8 @@
                 <w:rFonts w:ascii="Calibri" w:hAnsi="Calibri" w:cs="Calibri"/>
                 <w:b/>
                 <w:bCs/>
-                <w:sz w:val="20"/>
-                <w:szCs w:val="20"/>
+                <w:sz w:val="22"/>
+                <w:szCs w:val="22"/>
               </w:rPr>
               <w:t>Responsables</w:t>
             </w:r>
@@ -2151,15 +2423,15 @@
               <w:spacing w:after="40"/>
               <w:rPr>
                 <w:rFonts w:ascii="Calibri" w:hAnsi="Calibri" w:cs="Calibri"/>
-                <w:sz w:val="20"/>
-                <w:szCs w:val="20"/>
+                <w:sz w:val="22"/>
+                <w:szCs w:val="22"/>
               </w:rPr>
             </w:pPr>
             <w:r>
               <w:rPr>
                 <w:rFonts w:ascii="Calibri" w:hAnsi="Calibri" w:cs="Calibri"/>
-                <w:sz w:val="20"/>
-                <w:szCs w:val="20"/>
+                <w:sz w:val="22"/>
+                <w:szCs w:val="22"/>
               </w:rPr>
               <w:t>1.0</w:t>
             </w:r>
@@ -2175,15 +2447,15 @@
               <w:spacing w:after="40"/>
               <w:rPr>
                 <w:rFonts w:ascii="Calibri" w:hAnsi="Calibri" w:cs="Calibri"/>
-                <w:sz w:val="20"/>
-                <w:szCs w:val="20"/>
+                <w:sz w:val="22"/>
+                <w:szCs w:val="22"/>
               </w:rPr>
             </w:pPr>
             <w:r>
               <w:rPr>
                 <w:rFonts w:ascii="Calibri" w:hAnsi="Calibri" w:cs="Calibri"/>
-                <w:sz w:val="20"/>
-                <w:szCs w:val="20"/>
+                <w:sz w:val="22"/>
+                <w:szCs w:val="22"/>
               </w:rPr>
               <w:t>03-10-2026</w:t>
             </w:r>
@@ -2199,15 +2471,15 @@
               <w:spacing w:after="40"/>
               <w:rPr>
                 <w:rFonts w:ascii="Calibri" w:hAnsi="Calibri" w:cs="Calibri"/>
-                <w:sz w:val="20"/>
-                <w:szCs w:val="20"/>
+                <w:sz w:val="22"/>
+                <w:szCs w:val="22"/>
               </w:rPr>
             </w:pPr>
             <w:r>
               <w:rPr>
                 <w:rFonts w:ascii="Calibri" w:hAnsi="Calibri" w:cs="Calibri"/>
-                <w:sz w:val="20"/>
-                <w:szCs w:val="20"/>
+                <w:sz w:val="22"/>
+                <w:szCs w:val="22"/>
               </w:rPr>
               <w:t>Versión inicial de la Definition of Done del proyecto.</w:t>
             </w:r>
@@ -2223,15 +2495,15 @@
               <w:spacing w:after="40"/>
               <w:rPr>
                 <w:rFonts w:ascii="Calibri" w:hAnsi="Calibri" w:cs="Calibri"/>
-                <w:sz w:val="20"/>
-                <w:szCs w:val="20"/>
+                <w:sz w:val="22"/>
+                <w:szCs w:val="22"/>
               </w:rPr>
             </w:pPr>
             <w:r>
               <w:rPr>
                 <w:rFonts w:ascii="Calibri" w:hAnsi="Calibri" w:cs="Calibri"/>
-                <w:sz w:val="20"/>
-                <w:szCs w:val="20"/>
+                <w:sz w:val="22"/>
+                <w:szCs w:val="22"/>
               </w:rPr>
               <w:t>Alejandro Silva y Bastian Pino</w:t>
             </w:r>
@@ -2244,13 +2516,14 @@
         <w:jc w:val="both"/>
         <w:rPr>
           <w:rFonts w:ascii="Calibri" w:hAnsi="Calibri" w:cs="Calibri"/>
-          <w:sz w:val="20"/>
-          <w:szCs w:val="20"/>
+          <w:sz w:val="22"/>
+          <w:szCs w:val="22"/>
         </w:rPr>
       </w:pPr>
     </w:p>
     <w:sectPr>
       <w:headerReference w:type="default" r:id="rId8"/>
+      <w:footerReference w:type="default" r:id="rId9"/>
       <w:pgSz w:w="12240" w:h="15840"/>
       <w:pgMar w:top="1417" w:right="1701" w:bottom="1417" w:left="1701" w:header="708" w:footer="708" w:gutter="0"/>
       <w:cols w:space="708"/>
@@ -2265,7 +2538,7 @@
   <w:endnote w:type="separator" w:id="-1">
     <w:p>
       <w:pPr>
-        <w:spacing w:after="0" w:line="240" w:lineRule="auto"/>
+        <w:spacing w:after="0"/>
       </w:pPr>
       <w:r>
         <w:separator/>
@@ -2275,7 +2548,7 @@
   <w:endnote w:type="continuationSeparator" w:id="0">
     <w:p>
       <w:pPr>
-        <w:spacing w:after="0" w:line="240" w:lineRule="auto"/>
+        <w:spacing w:after="0"/>
       </w:pPr>
       <w:r>
         <w:continuationSeparator/>
@@ -2283,6 +2556,62 @@
     </w:p>
   </w:endnote>
 </w:endnotes>
+</file>
+
+<file path=word/footer1.xml><?xml version="1.0" encoding="utf-8"?>
+<w:ftr xmlns:wpc="http://schemas.microsoft.com/office/word/2010/wordprocessingCanvas" xmlns:cx="http://schemas.microsoft.com/office/drawing/2014/chartex" xmlns:cx1="http://schemas.microsoft.com/office/drawing/2015/9/8/chartex" xmlns:cx2="http://schemas.microsoft.com/office/drawing/2015/10/21/chartex" xmlns:cx3="http://schemas.microsoft.com/office/drawing/2016/5/9/chartex" xmlns:cx4="http://schemas.microsoft.com/office/drawing/2016/5/10/chartex" xmlns:cx5="http://schemas.microsoft.com/office/drawing/2016/5/11/chartex" xmlns:cx6="http://schemas.microsoft.com/office/drawing/2016/5/12/chartex" xmlns:cx7="http://schemas.microsoft.com/office/drawing/2016/5/13/chartex" xmlns:cx8="http://schemas.microsoft.com/office/drawing/2016/5/14/chartex" xmlns:mc="http://schemas.openxmlformats.org/markup-compatibility/2006" xmlns:aink="http://schemas.microsoft.com/office/drawing/2016/ink" xmlns:am3d="http://schemas.microsoft.com/office/drawing/2017/model3d" xmlns:o="urn:schemas-microsoft-com:office:office" xmlns:oel="http://schemas.microsoft.com/office/2019/extlst" xmlns:r="http://schemas.openxmlformats.org/officeDocument/2006/relationships" xmlns:m="http://schemas.openxmlformats.org/officeDocument/2006/math" xmlns:v="urn:schemas-microsoft-com:vml" xmlns:wp14="http://schemas.microsoft.com/office/word/2010/wordprocessingDrawing" xmlns:wp="http://schemas.openxmlformats.org/drawingml/2006/wordprocessingDrawing" xmlns:w10="urn:schemas-microsoft-com:office:word" xmlns:w="http://schemas.openxmlformats.org/wordprocessingml/2006/main" xmlns:w14="http://schemas.microsoft.com/office/word/2010/wordml" xmlns:w15="http://schemas.microsoft.com/office/word/2012/wordml" xmlns:w16cex="http://schemas.microsoft.com/office/word/2018/wordml/cex" xmlns:w16cid="http://schemas.microsoft.com/office/word/2016/wordml/cid" xmlns:w16="http://schemas.microsoft.com/office/word/2018/wordml" xmlns:w16du="http://schemas.microsoft.com/office/word/2023/wordml/word16du" xmlns:w16sdtdh="http://schemas.microsoft.com/office/word/2020/wordml/sdtdatahash" xmlns:w16sdtfl="http://schemas.microsoft.com/office/word/2024/wordml/sdtformatlock" xmlns:w16se="http://schemas.microsoft.com/office/word/2015/wordml/symex" xmlns:wpg="http://schemas.microsoft.com/office/word/2010/wordprocessingGroup" xmlns:wpi="http://schemas.microsoft.com/office/word/2010/wordprocessingInk" xmlns:wne="http://schemas.microsoft.com/office/word/2006/wordml" xmlns:wps="http://schemas.microsoft.com/office/word/2010/wordprocessingShape" mc:Ignorable="w14 w15 w16se w16cid w16 w16cex w16sdtdh w16sdtfl w16du wp14">
+  <w:p>
+    <w:pPr>
+      <w:pStyle w:val="Piedepgina"/>
+      <w:jc w:val="right"/>
+    </w:pPr>
+    <w:r>
+      <w:rPr>
+        <w:rFonts w:ascii="Calibri" w:hAnsi="Calibri" w:cs="Calibri"/>
+        <w:color w:val="595959"/>
+        <w:sz w:val="22"/>
+        <w:szCs w:val="22"/>
+      </w:rPr>
+      <w:fldChar w:fldCharType="begin"/>
+    </w:r>
+    <w:r>
+      <w:rPr>
+        <w:rFonts w:ascii="Calibri" w:hAnsi="Calibri" w:cs="Calibri"/>
+        <w:color w:val="595959"/>
+        <w:sz w:val="22"/>
+        <w:szCs w:val="22"/>
+      </w:rPr>
+      <w:instrText xml:space="preserve"> PAGE </w:instrText>
+    </w:r>
+    <w:r>
+      <w:rPr>
+        <w:rFonts w:ascii="Calibri" w:hAnsi="Calibri" w:cs="Calibri"/>
+        <w:color w:val="595959"/>
+        <w:sz w:val="22"/>
+        <w:szCs w:val="22"/>
+      </w:rPr>
+      <w:fldChar w:fldCharType="separate"/>
+    </w:r>
+    <w:r>
+      <w:rPr>
+        <w:rFonts w:ascii="Calibri" w:hAnsi="Calibri" w:cs="Calibri"/>
+        <w:color w:val="595959"/>
+        <w:sz w:val="22"/>
+        <w:szCs w:val="22"/>
+      </w:rPr>
+      <w:t>1</w:t>
+    </w:r>
+    <w:r>
+      <w:rPr>
+        <w:rFonts w:ascii="Calibri" w:hAnsi="Calibri" w:cs="Calibri"/>
+        <w:color w:val="595959"/>
+        <w:sz w:val="22"/>
+        <w:szCs w:val="22"/>
+      </w:rPr>
+      <w:fldChar w:fldCharType="end"/>
+    </w:r>
+  </w:p>
+</w:ftr>
 </file>
 
 <file path=word/footnotes.xml><?xml version="1.0" encoding="utf-8"?>
@@ -2290,7 +2619,7 @@
   <w:footnote w:type="separator" w:id="-1">
     <w:p>
       <w:pPr>
-        <w:spacing w:after="0" w:line="240" w:lineRule="auto"/>
+        <w:spacing w:after="0"/>
       </w:pPr>
       <w:r>
         <w:separator/>
@@ -2300,7 +2629,7 @@
   <w:footnote w:type="continuationSeparator" w:id="0">
     <w:p>
       <w:pPr>
-        <w:spacing w:after="0" w:line="240" w:lineRule="auto"/>
+        <w:spacing w:after="0"/>
       </w:pPr>
       <w:r>
         <w:continuationSeparator/>
@@ -2314,7 +2643,7 @@
 <w:hdr xmlns:wpc="http://schemas.microsoft.com/office/word/2010/wordprocessingCanvas" xmlns:cx="http://schemas.microsoft.com/office/drawing/2014/chartex" xmlns:cx1="http://schemas.microsoft.com/office/drawing/2015/9/8/chartex" xmlns:cx2="http://schemas.microsoft.com/office/drawing/2015/10/21/chartex" xmlns:cx3="http://schemas.microsoft.com/office/drawing/2016/5/9/chartex" xmlns:cx4="http://schemas.microsoft.com/office/drawing/2016/5/10/chartex" xmlns:cx5="http://schemas.microsoft.com/office/drawing/2016/5/11/chartex" xmlns:cx6="http://schemas.microsoft.com/office/drawing/2016/5/12/chartex" xmlns:cx7="http://schemas.microsoft.com/office/drawing/2016/5/13/chartex" xmlns:cx8="http://schemas.microsoft.com/office/drawing/2016/5/14/chartex" xmlns:mc="http://schemas.openxmlformats.org/markup-compatibility/2006" xmlns:aink="http://schemas.microsoft.com/office/drawing/2016/ink" xmlns:am3d="http://schemas.microsoft.com/office/drawing/2017/model3d" xmlns:o="urn:schemas-microsoft-com:office:office" xmlns:oel="http://schemas.microsoft.com/office/2019/extlst" xmlns:r="http://schemas.openxmlformats.org/officeDocument/2006/relationships" xmlns:m="http://schemas.openxmlformats.org/officeDocument/2006/math" xmlns:v="urn:schemas-microsoft-com:vml" xmlns:wp14="http://schemas.microsoft.com/office/word/2010/wordprocessingDrawing" xmlns:wp="http://schemas.openxmlformats.org/drawingml/2006/wordprocessingDrawing" xmlns:w10="urn:schemas-microsoft-com:office:word" xmlns:w="http://schemas.openxmlformats.org/wordprocessingml/2006/main" xmlns:w14="http://schemas.microsoft.com/office/word/2010/wordml" xmlns:w15="http://schemas.microsoft.com/office/word/2012/wordml" xmlns:w16cex="http://schemas.microsoft.com/office/word/2018/wordml/cex" xmlns:w16cid="http://schemas.microsoft.com/office/word/2016/wordml/cid" xmlns:w16="http://schemas.microsoft.com/office/word/2018/wordml" xmlns:w16du="http://schemas.microsoft.com/office/word/2023/wordml/word16du" xmlns:w16sdtdh="http://schemas.microsoft.com/office/word/2020/wordml/sdtdatahash" xmlns:w16sdtfl="http://schemas.microsoft.com/office/word/2024/wordml/sdtformatlock" xmlns:w16se="http://schemas.microsoft.com/office/word/2015/wordml/symex" xmlns:wpg="http://schemas.microsoft.com/office/word/2010/wordprocessingGroup" xmlns:wpi="http://schemas.microsoft.com/office/word/2010/wordprocessingInk" xmlns:wne="http://schemas.microsoft.com/office/word/2006/wordml" xmlns:wps="http://schemas.microsoft.com/office/word/2010/wordprocessingShape" mc:Ignorable="w14 w15 w16se w16cid w16 w16cex w16sdtdh w16sdtfl w16du wp14">
   <w:p>
     <w:pPr>
-      <w:pStyle w:val="Header"/>
+      <w:pStyle w:val="Encabezado"/>
     </w:pPr>
     <w:r>
       <w:rPr>
@@ -3920,7 +4249,7 @@
     </w:rPrDefault>
     <w:pPrDefault>
       <w:pPr>
-        <w:spacing w:after="160" w:line="278" w:lineRule="auto"/>
+        <w:spacing w:after="160"/>
       </w:pPr>
     </w:pPrDefault>
   </w:docDefaults>
@@ -4306,11 +4635,11 @@
     <w:name w:val="Normal"/>
     <w:qFormat/>
   </w:style>
-  <w:style w:type="paragraph" w:styleId="Heading1">
+  <w:style w:type="paragraph" w:styleId="Ttulo1">
     <w:name w:val="heading 1"/>
     <w:basedOn w:val="Normal"/>
     <w:next w:val="Normal"/>
-    <w:link w:val="Heading1Char"/>
+    <w:link w:val="Ttulo1Car"/>
     <w:uiPriority w:val="9"/>
     <w:qFormat/>
     <w:rsid w:val="00FE79DE"/>
@@ -4327,11 +4656,11 @@
       <w:szCs w:val="40"/>
     </w:rPr>
   </w:style>
-  <w:style w:type="paragraph" w:styleId="Heading2">
+  <w:style w:type="paragraph" w:styleId="Ttulo2">
     <w:name w:val="heading 2"/>
     <w:basedOn w:val="Normal"/>
     <w:next w:val="Normal"/>
-    <w:link w:val="Heading2Char"/>
+    <w:link w:val="Ttulo2Car"/>
     <w:uiPriority w:val="9"/>
     <w:unhideWhenUsed/>
     <w:qFormat/>
@@ -4349,11 +4678,11 @@
       <w:szCs w:val="32"/>
     </w:rPr>
   </w:style>
-  <w:style w:type="paragraph" w:styleId="Heading3">
+  <w:style w:type="paragraph" w:styleId="Ttulo3">
     <w:name w:val="heading 3"/>
     <w:basedOn w:val="Normal"/>
     <w:next w:val="Normal"/>
-    <w:link w:val="Heading3Char"/>
+    <w:link w:val="Ttulo3Car"/>
     <w:uiPriority w:val="9"/>
     <w:semiHidden/>
     <w:unhideWhenUsed/>
@@ -4372,11 +4701,11 @@
       <w:szCs w:val="28"/>
     </w:rPr>
   </w:style>
-  <w:style w:type="paragraph" w:styleId="Heading4">
+  <w:style w:type="paragraph" w:styleId="Ttulo4">
     <w:name w:val="heading 4"/>
     <w:basedOn w:val="Normal"/>
     <w:next w:val="Normal"/>
-    <w:link w:val="Heading4Char"/>
+    <w:link w:val="Ttulo4Car"/>
     <w:uiPriority w:val="9"/>
     <w:semiHidden/>
     <w:unhideWhenUsed/>
@@ -4395,11 +4724,11 @@
       <w:color w:val="0F4761" w:themeColor="accent1" w:themeShade="BF"/>
     </w:rPr>
   </w:style>
-  <w:style w:type="paragraph" w:styleId="Heading5">
+  <w:style w:type="paragraph" w:styleId="Ttulo5">
     <w:name w:val="heading 5"/>
     <w:basedOn w:val="Normal"/>
     <w:next w:val="Normal"/>
-    <w:link w:val="Heading5Char"/>
+    <w:link w:val="Ttulo5Car"/>
     <w:uiPriority w:val="9"/>
     <w:semiHidden/>
     <w:unhideWhenUsed/>
@@ -4416,11 +4745,11 @@
       <w:color w:val="0F4761" w:themeColor="accent1" w:themeShade="BF"/>
     </w:rPr>
   </w:style>
-  <w:style w:type="paragraph" w:styleId="Heading6">
+  <w:style w:type="paragraph" w:styleId="Ttulo6">
     <w:name w:val="heading 6"/>
     <w:basedOn w:val="Normal"/>
     <w:next w:val="Normal"/>
-    <w:link w:val="Heading6Char"/>
+    <w:link w:val="Ttulo6Car"/>
     <w:uiPriority w:val="9"/>
     <w:semiHidden/>
     <w:unhideWhenUsed/>
@@ -4439,11 +4768,11 @@
       <w:color w:val="595959" w:themeColor="text1" w:themeTint="A6"/>
     </w:rPr>
   </w:style>
-  <w:style w:type="paragraph" w:styleId="Heading7">
+  <w:style w:type="paragraph" w:styleId="Ttulo7">
     <w:name w:val="heading 7"/>
     <w:basedOn w:val="Normal"/>
     <w:next w:val="Normal"/>
-    <w:link w:val="Heading7Char"/>
+    <w:link w:val="Ttulo7Car"/>
     <w:uiPriority w:val="9"/>
     <w:semiHidden/>
     <w:unhideWhenUsed/>
@@ -4460,11 +4789,11 @@
       <w:color w:val="595959" w:themeColor="text1" w:themeTint="A6"/>
     </w:rPr>
   </w:style>
-  <w:style w:type="paragraph" w:styleId="Heading8">
+  <w:style w:type="paragraph" w:styleId="Ttulo8">
     <w:name w:val="heading 8"/>
     <w:basedOn w:val="Normal"/>
     <w:next w:val="Normal"/>
-    <w:link w:val="Heading8Char"/>
+    <w:link w:val="Ttulo8Car"/>
     <w:uiPriority w:val="9"/>
     <w:semiHidden/>
     <w:unhideWhenUsed/>
@@ -4483,11 +4812,11 @@
       <w:color w:val="272727" w:themeColor="text1" w:themeTint="D8"/>
     </w:rPr>
   </w:style>
-  <w:style w:type="paragraph" w:styleId="Heading9">
+  <w:style w:type="paragraph" w:styleId="Ttulo9">
     <w:name w:val="heading 9"/>
     <w:basedOn w:val="Normal"/>
     <w:next w:val="Normal"/>
-    <w:link w:val="Heading9Char"/>
+    <w:link w:val="Ttulo9Car"/>
     <w:uiPriority w:val="9"/>
     <w:semiHidden/>
     <w:unhideWhenUsed/>
@@ -4504,13 +4833,13 @@
       <w:color w:val="272727" w:themeColor="text1" w:themeTint="D8"/>
     </w:rPr>
   </w:style>
-  <w:style w:type="character" w:default="1" w:styleId="DefaultParagraphFont">
+  <w:style w:type="character" w:default="1" w:styleId="Fuentedeprrafopredeter">
     <w:name w:val="Default Paragraph Font"/>
     <w:uiPriority w:val="1"/>
     <w:semiHidden/>
     <w:unhideWhenUsed/>
   </w:style>
-  <w:style w:type="table" w:default="1" w:styleId="TableNormal">
+  <w:style w:type="table" w:default="1" w:styleId="Tablanormal">
     <w:name w:val="Normal Table"/>
     <w:uiPriority w:val="99"/>
     <w:semiHidden/>
@@ -4525,16 +4854,16 @@
       </w:tblCellMar>
     </w:tblPr>
   </w:style>
-  <w:style w:type="numbering" w:default="1" w:styleId="NoList">
+  <w:style w:type="numbering" w:default="1" w:styleId="Sinlista">
     <w:name w:val="No List"/>
     <w:uiPriority w:val="99"/>
     <w:semiHidden/>
     <w:unhideWhenUsed/>
   </w:style>
-  <w:style w:type="character" w:customStyle="1" w:styleId="Heading1Char">
-    <w:name w:val="Heading 1 Char"/>
-    <w:basedOn w:val="DefaultParagraphFont"/>
-    <w:link w:val="Heading1"/>
+  <w:style w:type="character" w:customStyle="1" w:styleId="Ttulo1Car">
+    <w:name w:val="Título 1 Car"/>
+    <w:basedOn w:val="Fuentedeprrafopredeter"/>
+    <w:link w:val="Ttulo1"/>
     <w:uiPriority w:val="9"/>
     <w:rsid w:val="00FE79DE"/>
     <w:rPr>
@@ -4544,10 +4873,10 @@
       <w:szCs w:val="40"/>
     </w:rPr>
   </w:style>
-  <w:style w:type="character" w:customStyle="1" w:styleId="Heading2Char">
-    <w:name w:val="Heading 2 Char"/>
-    <w:basedOn w:val="DefaultParagraphFont"/>
-    <w:link w:val="Heading2"/>
+  <w:style w:type="character" w:customStyle="1" w:styleId="Ttulo2Car">
+    <w:name w:val="Título 2 Car"/>
+    <w:basedOn w:val="Fuentedeprrafopredeter"/>
+    <w:link w:val="Ttulo2"/>
     <w:uiPriority w:val="9"/>
     <w:rsid w:val="00FE79DE"/>
     <w:rPr>
@@ -4557,10 +4886,10 @@
       <w:szCs w:val="32"/>
     </w:rPr>
   </w:style>
-  <w:style w:type="character" w:customStyle="1" w:styleId="Heading3Char">
-    <w:name w:val="Heading 3 Char"/>
-    <w:basedOn w:val="DefaultParagraphFont"/>
-    <w:link w:val="Heading3"/>
+  <w:style w:type="character" w:customStyle="1" w:styleId="Ttulo3Car">
+    <w:name w:val="Título 3 Car"/>
+    <w:basedOn w:val="Fuentedeprrafopredeter"/>
+    <w:link w:val="Ttulo3"/>
     <w:uiPriority w:val="9"/>
     <w:semiHidden/>
     <w:rsid w:val="00FE79DE"/>
@@ -4571,10 +4900,10 @@
       <w:szCs w:val="28"/>
     </w:rPr>
   </w:style>
-  <w:style w:type="character" w:customStyle="1" w:styleId="Heading4Char">
-    <w:name w:val="Heading 4 Char"/>
-    <w:basedOn w:val="DefaultParagraphFont"/>
-    <w:link w:val="Heading4"/>
+  <w:style w:type="character" w:customStyle="1" w:styleId="Ttulo4Car">
+    <w:name w:val="Título 4 Car"/>
+    <w:basedOn w:val="Fuentedeprrafopredeter"/>
+    <w:link w:val="Ttulo4"/>
     <w:uiPriority w:val="9"/>
     <w:semiHidden/>
     <w:rsid w:val="00FE79DE"/>
@@ -4585,10 +4914,10 @@
       <w:color w:val="0F4761" w:themeColor="accent1" w:themeShade="BF"/>
     </w:rPr>
   </w:style>
-  <w:style w:type="character" w:customStyle="1" w:styleId="Heading5Char">
-    <w:name w:val="Heading 5 Char"/>
-    <w:basedOn w:val="DefaultParagraphFont"/>
-    <w:link w:val="Heading5"/>
+  <w:style w:type="character" w:customStyle="1" w:styleId="Ttulo5Car">
+    <w:name w:val="Título 5 Car"/>
+    <w:basedOn w:val="Fuentedeprrafopredeter"/>
+    <w:link w:val="Ttulo5"/>
     <w:uiPriority w:val="9"/>
     <w:semiHidden/>
     <w:rsid w:val="00FE79DE"/>
@@ -4597,10 +4926,10 @@
       <w:color w:val="0F4761" w:themeColor="accent1" w:themeShade="BF"/>
     </w:rPr>
   </w:style>
-  <w:style w:type="character" w:customStyle="1" w:styleId="Heading6Char">
-    <w:name w:val="Heading 6 Char"/>
-    <w:basedOn w:val="DefaultParagraphFont"/>
-    <w:link w:val="Heading6"/>
+  <w:style w:type="character" w:customStyle="1" w:styleId="Ttulo6Car">
+    <w:name w:val="Título 6 Car"/>
+    <w:basedOn w:val="Fuentedeprrafopredeter"/>
+    <w:link w:val="Ttulo6"/>
     <w:uiPriority w:val="9"/>
     <w:semiHidden/>
     <w:rsid w:val="00FE79DE"/>
@@ -4611,10 +4940,10 @@
       <w:color w:val="595959" w:themeColor="text1" w:themeTint="A6"/>
     </w:rPr>
   </w:style>
-  <w:style w:type="character" w:customStyle="1" w:styleId="Heading7Char">
-    <w:name w:val="Heading 7 Char"/>
-    <w:basedOn w:val="DefaultParagraphFont"/>
-    <w:link w:val="Heading7"/>
+  <w:style w:type="character" w:customStyle="1" w:styleId="Ttulo7Car">
+    <w:name w:val="Título 7 Car"/>
+    <w:basedOn w:val="Fuentedeprrafopredeter"/>
+    <w:link w:val="Ttulo7"/>
     <w:uiPriority w:val="9"/>
     <w:semiHidden/>
     <w:rsid w:val="00FE79DE"/>
@@ -4623,10 +4952,10 @@
       <w:color w:val="595959" w:themeColor="text1" w:themeTint="A6"/>
     </w:rPr>
   </w:style>
-  <w:style w:type="character" w:customStyle="1" w:styleId="Heading8Char">
-    <w:name w:val="Heading 8 Char"/>
-    <w:basedOn w:val="DefaultParagraphFont"/>
-    <w:link w:val="Heading8"/>
+  <w:style w:type="character" w:customStyle="1" w:styleId="Ttulo8Car">
+    <w:name w:val="Título 8 Car"/>
+    <w:basedOn w:val="Fuentedeprrafopredeter"/>
+    <w:link w:val="Ttulo8"/>
     <w:uiPriority w:val="9"/>
     <w:semiHidden/>
     <w:rsid w:val="00FE79DE"/>
@@ -4637,10 +4966,10 @@
       <w:color w:val="272727" w:themeColor="text1" w:themeTint="D8"/>
     </w:rPr>
   </w:style>
-  <w:style w:type="character" w:customStyle="1" w:styleId="Heading9Char">
-    <w:name w:val="Heading 9 Char"/>
-    <w:basedOn w:val="DefaultParagraphFont"/>
-    <w:link w:val="Heading9"/>
+  <w:style w:type="character" w:customStyle="1" w:styleId="Ttulo9Car">
+    <w:name w:val="Título 9 Car"/>
+    <w:basedOn w:val="Fuentedeprrafopredeter"/>
+    <w:link w:val="Ttulo9"/>
     <w:uiPriority w:val="9"/>
     <w:semiHidden/>
     <w:rsid w:val="00FE79DE"/>
@@ -4649,16 +4978,16 @@
       <w:color w:val="272727" w:themeColor="text1" w:themeTint="D8"/>
     </w:rPr>
   </w:style>
-  <w:style w:type="paragraph" w:styleId="Title">
+  <w:style w:type="paragraph" w:styleId="Ttulo">
     <w:name w:val="Title"/>
     <w:basedOn w:val="Normal"/>
     <w:next w:val="Normal"/>
-    <w:link w:val="TitleChar"/>
+    <w:link w:val="TtuloCar"/>
     <w:uiPriority w:val="10"/>
     <w:qFormat/>
     <w:rsid w:val="00FE79DE"/>
     <w:pPr>
-      <w:spacing w:after="80" w:line="240" w:lineRule="auto"/>
+      <w:spacing w:after="80"/>
       <w:contextualSpacing/>
     </w:pPr>
     <w:rPr>
@@ -4669,10 +4998,10 @@
       <w:szCs w:val="56"/>
     </w:rPr>
   </w:style>
-  <w:style w:type="character" w:customStyle="1" w:styleId="TitleChar">
-    <w:name w:val="Title Char"/>
-    <w:basedOn w:val="DefaultParagraphFont"/>
-    <w:link w:val="Title"/>
+  <w:style w:type="character" w:customStyle="1" w:styleId="TtuloCar">
+    <w:name w:val="Título Car"/>
+    <w:basedOn w:val="Fuentedeprrafopredeter"/>
+    <w:link w:val="Ttulo"/>
     <w:uiPriority w:val="10"/>
     <w:rsid w:val="00FE79DE"/>
     <w:rPr>
@@ -4683,11 +5012,11 @@
       <w:szCs w:val="56"/>
     </w:rPr>
   </w:style>
-  <w:style w:type="paragraph" w:styleId="Subtitle">
+  <w:style w:type="paragraph" w:styleId="Subttulo">
     <w:name w:val="Subtitle"/>
     <w:basedOn w:val="Normal"/>
     <w:next w:val="Normal"/>
-    <w:link w:val="SubtitleChar"/>
+    <w:link w:val="SubttuloCar"/>
     <w:uiPriority w:val="11"/>
     <w:qFormat/>
     <w:rsid w:val="00FE79DE"/>
@@ -4704,10 +5033,10 @@
       <w:szCs w:val="28"/>
     </w:rPr>
   </w:style>
-  <w:style w:type="character" w:customStyle="1" w:styleId="SubtitleChar">
-    <w:name w:val="Subtitle Char"/>
-    <w:basedOn w:val="DefaultParagraphFont"/>
-    <w:link w:val="Subtitle"/>
+  <w:style w:type="character" w:customStyle="1" w:styleId="SubttuloCar">
+    <w:name w:val="Subtítulo Car"/>
+    <w:basedOn w:val="Fuentedeprrafopredeter"/>
+    <w:link w:val="Subttulo"/>
     <w:uiPriority w:val="11"/>
     <w:rsid w:val="00FE79DE"/>
     <w:rPr>
@@ -4718,11 +5047,11 @@
       <w:szCs w:val="28"/>
     </w:rPr>
   </w:style>
-  <w:style w:type="paragraph" w:styleId="Quote">
+  <w:style w:type="paragraph" w:styleId="Cita">
     <w:name w:val="Quote"/>
     <w:basedOn w:val="Normal"/>
     <w:next w:val="Normal"/>
-    <w:link w:val="QuoteChar"/>
+    <w:link w:val="CitaCar"/>
     <w:uiPriority w:val="29"/>
     <w:qFormat/>
     <w:rsid w:val="00FE79DE"/>
@@ -4736,10 +5065,10 @@
       <w:color w:val="404040" w:themeColor="text1" w:themeTint="BF"/>
     </w:rPr>
   </w:style>
-  <w:style w:type="character" w:customStyle="1" w:styleId="QuoteChar">
-    <w:name w:val="Quote Char"/>
-    <w:basedOn w:val="DefaultParagraphFont"/>
-    <w:link w:val="Quote"/>
+  <w:style w:type="character" w:customStyle="1" w:styleId="CitaCar">
+    <w:name w:val="Cita Car"/>
+    <w:basedOn w:val="Fuentedeprrafopredeter"/>
+    <w:link w:val="Cita"/>
     <w:uiPriority w:val="29"/>
     <w:rsid w:val="00FE79DE"/>
     <w:rPr>
@@ -4748,7 +5077,7 @@
       <w:color w:val="404040" w:themeColor="text1" w:themeTint="BF"/>
     </w:rPr>
   </w:style>
-  <w:style w:type="paragraph" w:styleId="ListParagraph">
+  <w:style w:type="paragraph" w:styleId="Prrafodelista">
     <w:name w:val="List Paragraph"/>
     <w:basedOn w:val="Normal"/>
     <w:uiPriority w:val="34"/>
@@ -4759,9 +5088,9 @@
       <w:contextualSpacing/>
     </w:pPr>
   </w:style>
-  <w:style w:type="character" w:styleId="IntenseEmphasis">
+  <w:style w:type="character" w:styleId="nfasisintenso">
     <w:name w:val="Intense Emphasis"/>
-    <w:basedOn w:val="DefaultParagraphFont"/>
+    <w:basedOn w:val="Fuentedeprrafopredeter"/>
     <w:uiPriority w:val="21"/>
     <w:qFormat/>
     <w:rsid w:val="00FE79DE"/>
@@ -4771,11 +5100,11 @@
       <w:color w:val="0F4761" w:themeColor="accent1" w:themeShade="BF"/>
     </w:rPr>
   </w:style>
-  <w:style w:type="paragraph" w:styleId="IntenseQuote">
+  <w:style w:type="paragraph" w:styleId="Citadestacada">
     <w:name w:val="Intense Quote"/>
     <w:basedOn w:val="Normal"/>
     <w:next w:val="Normal"/>
-    <w:link w:val="IntenseQuoteChar"/>
+    <w:link w:val="CitadestacadaCar"/>
     <w:uiPriority w:val="30"/>
     <w:qFormat/>
     <w:rsid w:val="00FE79DE"/>
@@ -4794,10 +5123,10 @@
       <w:color w:val="0F4761" w:themeColor="accent1" w:themeShade="BF"/>
     </w:rPr>
   </w:style>
-  <w:style w:type="character" w:customStyle="1" w:styleId="IntenseQuoteChar">
-    <w:name w:val="Intense Quote Char"/>
-    <w:basedOn w:val="DefaultParagraphFont"/>
-    <w:link w:val="IntenseQuote"/>
+  <w:style w:type="character" w:customStyle="1" w:styleId="CitadestacadaCar">
+    <w:name w:val="Cita destacada Car"/>
+    <w:basedOn w:val="Fuentedeprrafopredeter"/>
+    <w:link w:val="Citadestacada"/>
     <w:uiPriority w:val="30"/>
     <w:rsid w:val="00FE79DE"/>
     <w:rPr>
@@ -4806,9 +5135,9 @@
       <w:color w:val="0F4761" w:themeColor="accent1" w:themeShade="BF"/>
     </w:rPr>
   </w:style>
-  <w:style w:type="character" w:styleId="IntenseReference">
+  <w:style w:type="character" w:styleId="Referenciaintensa">
     <w:name w:val="Intense Reference"/>
-    <w:basedOn w:val="DefaultParagraphFont"/>
+    <w:basedOn w:val="Fuentedeprrafopredeter"/>
     <w:uiPriority w:val="32"/>
     <w:qFormat/>
     <w:rsid w:val="00FE79DE"/>
@@ -4820,9 +5149,9 @@
       <w:spacing w:val="5"/>
     </w:rPr>
   </w:style>
-  <w:style w:type="paragraph" w:styleId="TOCHeading">
+  <w:style w:type="paragraph" w:styleId="TtuloTDC">
     <w:name w:val="TOC Heading"/>
-    <w:basedOn w:val="Heading1"/>
+    <w:basedOn w:val="Ttulo1"/>
     <w:next w:val="Normal"/>
     <w:uiPriority w:val="39"/>
     <w:unhideWhenUsed/>
@@ -4840,7 +5169,7 @@
       <w14:ligatures w14:val="none"/>
     </w:rPr>
   </w:style>
-  <w:style w:type="paragraph" w:styleId="TOC1">
+  <w:style w:type="paragraph" w:styleId="TDC1">
     <w:name w:val="toc 1"/>
     <w:basedOn w:val="Normal"/>
     <w:next w:val="Normal"/>
@@ -4852,7 +5181,7 @@
       <w:spacing w:after="100"/>
     </w:pPr>
   </w:style>
-  <w:style w:type="paragraph" w:styleId="TOC2">
+  <w:style w:type="paragraph" w:styleId="TDC2">
     <w:name w:val="toc 2"/>
     <w:basedOn w:val="Normal"/>
     <w:next w:val="Normal"/>
@@ -4865,9 +5194,9 @@
       <w:ind w:left="240"/>
     </w:pPr>
   </w:style>
-  <w:style w:type="character" w:styleId="Hyperlink">
+  <w:style w:type="character" w:styleId="Hipervnculo">
     <w:name w:val="Hyperlink"/>
-    <w:basedOn w:val="DefaultParagraphFont"/>
+    <w:basedOn w:val="Fuentedeprrafopredeter"/>
     <w:uiPriority w:val="99"/>
     <w:unhideWhenUsed/>
     <w:rsid w:val="00610EEE"/>
@@ -4876,10 +5205,10 @@
       <w:u w:val="single"/>
     </w:rPr>
   </w:style>
-  <w:style w:type="paragraph" w:styleId="Header">
+  <w:style w:type="paragraph" w:styleId="Encabezado">
     <w:name w:val="header"/>
     <w:basedOn w:val="Normal"/>
-    <w:link w:val="HeaderChar"/>
+    <w:link w:val="EncabezadoCar"/>
     <w:uiPriority w:val="99"/>
     <w:unhideWhenUsed/>
     <w:rsid w:val="00610EEE"/>
@@ -4888,20 +5217,20 @@
         <w:tab w:val="center" w:pos="4419"/>
         <w:tab w:val="right" w:pos="8838"/>
       </w:tabs>
-      <w:spacing w:after="0" w:line="240" w:lineRule="auto"/>
+      <w:spacing w:after="0"/>
     </w:pPr>
   </w:style>
-  <w:style w:type="character" w:customStyle="1" w:styleId="HeaderChar">
-    <w:name w:val="Header Char"/>
-    <w:basedOn w:val="DefaultParagraphFont"/>
-    <w:link w:val="Header"/>
+  <w:style w:type="character" w:customStyle="1" w:styleId="EncabezadoCar">
+    <w:name w:val="Encabezado Car"/>
+    <w:basedOn w:val="Fuentedeprrafopredeter"/>
+    <w:link w:val="Encabezado"/>
     <w:uiPriority w:val="99"/>
     <w:rsid w:val="00610EEE"/>
   </w:style>
-  <w:style w:type="paragraph" w:styleId="Footer">
+  <w:style w:type="paragraph" w:styleId="Piedepgina">
     <w:name w:val="footer"/>
     <w:basedOn w:val="Normal"/>
-    <w:link w:val="FooterChar"/>
+    <w:link w:val="PiedepginaCar"/>
     <w:uiPriority w:val="99"/>
     <w:unhideWhenUsed/>
     <w:rsid w:val="00610EEE"/>
@@ -4910,13 +5239,13 @@
         <w:tab w:val="center" w:pos="4419"/>
         <w:tab w:val="right" w:pos="8838"/>
       </w:tabs>
-      <w:spacing w:after="0" w:line="240" w:lineRule="auto"/>
+      <w:spacing w:after="0"/>
     </w:pPr>
   </w:style>
-  <w:style w:type="character" w:customStyle="1" w:styleId="FooterChar">
-    <w:name w:val="Footer Char"/>
-    <w:basedOn w:val="DefaultParagraphFont"/>
-    <w:link w:val="Footer"/>
+  <w:style w:type="character" w:customStyle="1" w:styleId="PiedepginaCar">
+    <w:name w:val="Pie de página Car"/>
+    <w:basedOn w:val="Fuentedeprrafopredeter"/>
+    <w:link w:val="Piedepgina"/>
     <w:uiPriority w:val="99"/>
     <w:rsid w:val="00610EEE"/>
   </w:style>
@@ -4966,7 +5295,7 @@
     </a:clrScheme>
     <a:fontScheme name="Office">
       <a:majorFont>
-        <a:latin typeface="Aptos Display" panose="02110004020202020204"/>
+        <a:latin typeface="Calibri" panose="02110004020202020204"/>
         <a:ea typeface=""/>
         <a:cs typeface=""/>
         <a:font script="Jpan" typeface="游ゴシック Light"/>
@@ -5018,7 +5347,7 @@
         <a:font script="Tfng" typeface="Ebrima"/>
       </a:majorFont>
       <a:minorFont>
-        <a:latin typeface="Aptos" panose="02110004020202020204"/>
+        <a:latin typeface="Calibri" panose="02110004020202020204"/>
         <a:ea typeface=""/>
         <a:cs typeface=""/>
         <a:font script="Jpan" typeface="游明朝"/>

</xml_diff>